<commit_message>
Fix oversized footnote numbers in the study guide
Footnotes now use Footnote Text / Footnote Reference styles, so the
number at the page bottom is a small superscript in Word and PDF.

Co-Authored-By: Claude Opus 5.5 <noreply@anthropic.com>
Claude-Session: https://claude.ai/code/session_012kArxnKKYGsae4V2Rgz4Qe
</commit_message>
<xml_diff>
--- a/oquv-qollanma/Metodika_fanlarini_oqitish_texnologiyasi_oquv_qollanma.docx
+++ b/oquv-qollanma/Metodika_fanlarini_oqitish_texnologiyasi_oquv_qollanma.docx
@@ -258,7 +258,7 @@
           <w:i w:val="false"/>
           <w:sz w:val="26"/>
         </w:rPr>
-        <w:t>Metodika fanlarini o‘qitish texnologiyasi: o‘quv qo‘llanma / D.N.Iminova. – Andijon: ADPI, 2026. – 121 b.</w:t>
+        <w:t>Metodika fanlarini o‘qitish texnologiyasi: o‘quv qo‘llanma / D.N.Iminova. – Andijon: ADPI, 2026. – 120 b.</w:t>
       </w:r>
     </w:p>
     <w:p>
@@ -533,7 +533,7 @@
             </w:rPr>
             <w:fldChar w:fldCharType="separate"/>
           </w:r>
-          <w:hyperlink w:anchor="__RefHeading___Toc5225_3488861905">
+          <w:hyperlink w:anchor="__RefHeading___Toc5225_1888984076">
             <w:r>
               <w:rPr>
                 <w:webHidden/>
@@ -560,7 +560,7 @@
             </w:tabs>
             <w:rPr/>
           </w:pPr>
-          <w:hyperlink w:anchor="__RefHeading___Toc5227_3488861905">
+          <w:hyperlink w:anchor="__RefHeading___Toc5227_1888984076">
             <w:r>
               <w:rPr>
                 <w:webHidden/>
@@ -574,7 +574,7 @@
                 <w:rStyle w:val="IndexLink"/>
               </w:rPr>
               <w:tab/>
-              <w:t>11</w:t>
+              <w:t>10</w:t>
             </w:r>
           </w:hyperlink>
         </w:p>
@@ -587,7 +587,7 @@
             </w:tabs>
             <w:rPr/>
           </w:pPr>
-          <w:hyperlink w:anchor="__RefHeading___Toc5229_3488861905">
+          <w:hyperlink w:anchor="__RefHeading___Toc5229_1888984076">
             <w:r>
               <w:rPr>
                 <w:webHidden/>
@@ -601,7 +601,7 @@
                 <w:rStyle w:val="IndexLink"/>
               </w:rPr>
               <w:tab/>
-              <w:t>11</w:t>
+              <w:t>10</w:t>
             </w:r>
           </w:hyperlink>
         </w:p>
@@ -614,7 +614,7 @@
             </w:tabs>
             <w:rPr/>
           </w:pPr>
-          <w:hyperlink w:anchor="__RefHeading___Toc5231_3488861905">
+          <w:hyperlink w:anchor="__RefHeading___Toc5231_1888984076">
             <w:r>
               <w:rPr>
                 <w:webHidden/>
@@ -628,7 +628,7 @@
                 <w:rStyle w:val="IndexLink"/>
               </w:rPr>
               <w:tab/>
-              <w:t>12</w:t>
+              <w:t>11</w:t>
             </w:r>
           </w:hyperlink>
         </w:p>
@@ -641,7 +641,7 @@
             </w:tabs>
             <w:rPr/>
           </w:pPr>
-          <w:hyperlink w:anchor="__RefHeading___Toc5233_3488861905">
+          <w:hyperlink w:anchor="__RefHeading___Toc5233_1888984076">
             <w:r>
               <w:rPr>
                 <w:webHidden/>
@@ -655,7 +655,7 @@
                 <w:rStyle w:val="IndexLink"/>
               </w:rPr>
               <w:tab/>
-              <w:t>14</w:t>
+              <w:t>13</w:t>
             </w:r>
           </w:hyperlink>
         </w:p>
@@ -668,7 +668,7 @@
             </w:tabs>
             <w:rPr/>
           </w:pPr>
-          <w:hyperlink w:anchor="__RefHeading___Toc5235_3488861905">
+          <w:hyperlink w:anchor="__RefHeading___Toc5235_1888984076">
             <w:r>
               <w:rPr>
                 <w:webHidden/>
@@ -682,7 +682,7 @@
                 <w:rStyle w:val="IndexLink"/>
               </w:rPr>
               <w:tab/>
-              <w:t>15</w:t>
+              <w:t>14</w:t>
             </w:r>
           </w:hyperlink>
         </w:p>
@@ -695,7 +695,7 @@
             </w:tabs>
             <w:rPr/>
           </w:pPr>
-          <w:hyperlink w:anchor="__RefHeading___Toc5237_3488861905">
+          <w:hyperlink w:anchor="__RefHeading___Toc5237_1888984076">
             <w:r>
               <w:rPr>
                 <w:webHidden/>
@@ -709,7 +709,7 @@
                 <w:rStyle w:val="IndexLink"/>
               </w:rPr>
               <w:tab/>
-              <w:t>17</w:t>
+              <w:t>16</w:t>
             </w:r>
           </w:hyperlink>
         </w:p>
@@ -722,7 +722,7 @@
             </w:tabs>
             <w:rPr/>
           </w:pPr>
-          <w:hyperlink w:anchor="__RefHeading___Toc5239_3488861905">
+          <w:hyperlink w:anchor="__RefHeading___Toc5239_1888984076">
             <w:r>
               <w:rPr>
                 <w:webHidden/>
@@ -736,7 +736,7 @@
                 <w:rStyle w:val="IndexLink"/>
               </w:rPr>
               <w:tab/>
-              <w:t>17</w:t>
+              <w:t>16</w:t>
             </w:r>
           </w:hyperlink>
         </w:p>
@@ -749,7 +749,7 @@
             </w:tabs>
             <w:rPr/>
           </w:pPr>
-          <w:hyperlink w:anchor="__RefHeading___Toc5241_3488861905">
+          <w:hyperlink w:anchor="__RefHeading___Toc5241_1888984076">
             <w:r>
               <w:rPr>
                 <w:webHidden/>
@@ -763,7 +763,7 @@
                 <w:rStyle w:val="IndexLink"/>
               </w:rPr>
               <w:tab/>
-              <w:t>23</w:t>
+              <w:t>22</w:t>
             </w:r>
           </w:hyperlink>
         </w:p>
@@ -776,7 +776,7 @@
             </w:tabs>
             <w:rPr/>
           </w:pPr>
-          <w:hyperlink w:anchor="__RefHeading___Toc5243_3488861905">
+          <w:hyperlink w:anchor="__RefHeading___Toc5243_1888984076">
             <w:r>
               <w:rPr>
                 <w:webHidden/>
@@ -790,7 +790,7 @@
                 <w:rStyle w:val="IndexLink"/>
               </w:rPr>
               <w:tab/>
-              <w:t>23</w:t>
+              <w:t>22</w:t>
             </w:r>
           </w:hyperlink>
         </w:p>
@@ -803,7 +803,7 @@
             </w:tabs>
             <w:rPr/>
           </w:pPr>
-          <w:hyperlink w:anchor="__RefHeading___Toc5245_3488861905">
+          <w:hyperlink w:anchor="__RefHeading___Toc5245_1888984076">
             <w:r>
               <w:rPr>
                 <w:webHidden/>
@@ -817,7 +817,7 @@
                 <w:rStyle w:val="IndexLink"/>
               </w:rPr>
               <w:tab/>
-              <w:t>24</w:t>
+              <w:t>23</w:t>
             </w:r>
           </w:hyperlink>
         </w:p>
@@ -830,7 +830,7 @@
             </w:tabs>
             <w:rPr/>
           </w:pPr>
-          <w:hyperlink w:anchor="__RefHeading___Toc5247_3488861905">
+          <w:hyperlink w:anchor="__RefHeading___Toc5247_1888984076">
             <w:r>
               <w:rPr>
                 <w:webHidden/>
@@ -844,7 +844,7 @@
                 <w:rStyle w:val="IndexLink"/>
               </w:rPr>
               <w:tab/>
-              <w:t>24</w:t>
+              <w:t>23</w:t>
             </w:r>
           </w:hyperlink>
         </w:p>
@@ -857,7 +857,7 @@
             </w:tabs>
             <w:rPr/>
           </w:pPr>
-          <w:hyperlink w:anchor="__RefHeading___Toc5249_3488861905">
+          <w:hyperlink w:anchor="__RefHeading___Toc5249_1888984076">
             <w:r>
               <w:rPr>
                 <w:webHidden/>
@@ -871,7 +871,7 @@
                 <w:rStyle w:val="IndexLink"/>
               </w:rPr>
               <w:tab/>
-              <w:t>25</w:t>
+              <w:t>24</w:t>
             </w:r>
           </w:hyperlink>
         </w:p>
@@ -884,7 +884,7 @@
             </w:tabs>
             <w:rPr/>
           </w:pPr>
-          <w:hyperlink w:anchor="__RefHeading___Toc5251_3488861905">
+          <w:hyperlink w:anchor="__RefHeading___Toc5251_1888984076">
             <w:r>
               <w:rPr>
                 <w:webHidden/>
@@ -898,7 +898,7 @@
                 <w:rStyle w:val="IndexLink"/>
               </w:rPr>
               <w:tab/>
-              <w:t>27</w:t>
+              <w:t>26</w:t>
             </w:r>
           </w:hyperlink>
         </w:p>
@@ -911,7 +911,7 @@
             </w:tabs>
             <w:rPr/>
           </w:pPr>
-          <w:hyperlink w:anchor="__RefHeading___Toc5253_3488861905">
+          <w:hyperlink w:anchor="__RefHeading___Toc5253_1888984076">
             <w:r>
               <w:rPr>
                 <w:webHidden/>
@@ -925,7 +925,7 @@
                 <w:rStyle w:val="IndexLink"/>
               </w:rPr>
               <w:tab/>
-              <w:t>28</w:t>
+              <w:t>27</w:t>
             </w:r>
           </w:hyperlink>
         </w:p>
@@ -938,7 +938,7 @@
             </w:tabs>
             <w:rPr/>
           </w:pPr>
-          <w:hyperlink w:anchor="__RefHeading___Toc5255_3488861905">
+          <w:hyperlink w:anchor="__RefHeading___Toc5255_1888984076">
             <w:r>
               <w:rPr>
                 <w:webHidden/>
@@ -952,7 +952,7 @@
                 <w:rStyle w:val="IndexLink"/>
               </w:rPr>
               <w:tab/>
-              <w:t>33</w:t>
+              <w:t>32</w:t>
             </w:r>
           </w:hyperlink>
         </w:p>
@@ -965,7 +965,7 @@
             </w:tabs>
             <w:rPr/>
           </w:pPr>
-          <w:hyperlink w:anchor="__RefHeading___Toc5257_3488861905">
+          <w:hyperlink w:anchor="__RefHeading___Toc5257_1888984076">
             <w:r>
               <w:rPr>
                 <w:webHidden/>
@@ -979,7 +979,7 @@
                 <w:rStyle w:val="IndexLink"/>
               </w:rPr>
               <w:tab/>
-              <w:t>33</w:t>
+              <w:t>32</w:t>
             </w:r>
           </w:hyperlink>
         </w:p>
@@ -992,7 +992,7 @@
             </w:tabs>
             <w:rPr/>
           </w:pPr>
-          <w:hyperlink w:anchor="__RefHeading___Toc5259_3488861905">
+          <w:hyperlink w:anchor="__RefHeading___Toc5259_1888984076">
             <w:r>
               <w:rPr>
                 <w:webHidden/>
@@ -1006,7 +1006,7 @@
                 <w:rStyle w:val="IndexLink"/>
               </w:rPr>
               <w:tab/>
-              <w:t>34</w:t>
+              <w:t>33</w:t>
             </w:r>
           </w:hyperlink>
         </w:p>
@@ -1019,7 +1019,7 @@
             </w:tabs>
             <w:rPr/>
           </w:pPr>
-          <w:hyperlink w:anchor="__RefHeading___Toc5261_3488861905">
+          <w:hyperlink w:anchor="__RefHeading___Toc5261_1888984076">
             <w:r>
               <w:rPr>
                 <w:webHidden/>
@@ -1033,7 +1033,7 @@
                 <w:rStyle w:val="IndexLink"/>
               </w:rPr>
               <w:tab/>
-              <w:t>34</w:t>
+              <w:t>33</w:t>
             </w:r>
           </w:hyperlink>
         </w:p>
@@ -1046,7 +1046,7 @@
             </w:tabs>
             <w:rPr/>
           </w:pPr>
-          <w:hyperlink w:anchor="__RefHeading___Toc5263_3488861905">
+          <w:hyperlink w:anchor="__RefHeading___Toc5263_1888984076">
             <w:r>
               <w:rPr>
                 <w:webHidden/>
@@ -1060,7 +1060,7 @@
                 <w:rStyle w:val="IndexLink"/>
               </w:rPr>
               <w:tab/>
-              <w:t>36</w:t>
+              <w:t>35</w:t>
             </w:r>
           </w:hyperlink>
         </w:p>
@@ -1073,7 +1073,7 @@
             </w:tabs>
             <w:rPr/>
           </w:pPr>
-          <w:hyperlink w:anchor="__RefHeading___Toc5265_3488861905">
+          <w:hyperlink w:anchor="__RefHeading___Toc5265_1888984076">
             <w:r>
               <w:rPr>
                 <w:webHidden/>
@@ -1087,7 +1087,7 @@
                 <w:rStyle w:val="IndexLink"/>
               </w:rPr>
               <w:tab/>
-              <w:t>37</w:t>
+              <w:t>36</w:t>
             </w:r>
           </w:hyperlink>
         </w:p>
@@ -1100,7 +1100,7 @@
             </w:tabs>
             <w:rPr/>
           </w:pPr>
-          <w:hyperlink w:anchor="__RefHeading___Toc5267_3488861905">
+          <w:hyperlink w:anchor="__RefHeading___Toc5267_1888984076">
             <w:r>
               <w:rPr>
                 <w:webHidden/>
@@ -1114,7 +1114,7 @@
                 <w:rStyle w:val="IndexLink"/>
               </w:rPr>
               <w:tab/>
-              <w:t>37</w:t>
+              <w:t>36</w:t>
             </w:r>
           </w:hyperlink>
         </w:p>
@@ -1127,7 +1127,7 @@
             </w:tabs>
             <w:rPr/>
           </w:pPr>
-          <w:hyperlink w:anchor="__RefHeading___Toc5269_3488861905">
+          <w:hyperlink w:anchor="__RefHeading___Toc5269_1888984076">
             <w:r>
               <w:rPr>
                 <w:webHidden/>
@@ -1141,7 +1141,7 @@
                 <w:rStyle w:val="IndexLink"/>
               </w:rPr>
               <w:tab/>
-              <w:t>42</w:t>
+              <w:t>41</w:t>
             </w:r>
           </w:hyperlink>
         </w:p>
@@ -1154,7 +1154,7 @@
             </w:tabs>
             <w:rPr/>
           </w:pPr>
-          <w:hyperlink w:anchor="__RefHeading___Toc5271_3488861905">
+          <w:hyperlink w:anchor="__RefHeading___Toc5271_1888984076">
             <w:r>
               <w:rPr>
                 <w:webHidden/>
@@ -1168,7 +1168,7 @@
                 <w:rStyle w:val="IndexLink"/>
               </w:rPr>
               <w:tab/>
-              <w:t>42</w:t>
+              <w:t>41</w:t>
             </w:r>
           </w:hyperlink>
         </w:p>
@@ -1181,7 +1181,7 @@
             </w:tabs>
             <w:rPr/>
           </w:pPr>
-          <w:hyperlink w:anchor="__RefHeading___Toc5273_3488861905">
+          <w:hyperlink w:anchor="__RefHeading___Toc5273_1888984076">
             <w:r>
               <w:rPr>
                 <w:webHidden/>
@@ -1195,7 +1195,7 @@
                 <w:rStyle w:val="IndexLink"/>
               </w:rPr>
               <w:tab/>
-              <w:t>43</w:t>
+              <w:t>42</w:t>
             </w:r>
           </w:hyperlink>
         </w:p>
@@ -1208,7 +1208,7 @@
             </w:tabs>
             <w:rPr/>
           </w:pPr>
-          <w:hyperlink w:anchor="__RefHeading___Toc5275_3488861905">
+          <w:hyperlink w:anchor="__RefHeading___Toc5275_1888984076">
             <w:r>
               <w:rPr>
                 <w:webHidden/>
@@ -1222,7 +1222,7 @@
                 <w:rStyle w:val="IndexLink"/>
               </w:rPr>
               <w:tab/>
-              <w:t>44</w:t>
+              <w:t>43</w:t>
             </w:r>
           </w:hyperlink>
         </w:p>
@@ -1235,7 +1235,7 @@
             </w:tabs>
             <w:rPr/>
           </w:pPr>
-          <w:hyperlink w:anchor="__RefHeading___Toc5277_3488861905">
+          <w:hyperlink w:anchor="__RefHeading___Toc5277_1888984076">
             <w:r>
               <w:rPr>
                 <w:webHidden/>
@@ -1249,7 +1249,7 @@
                 <w:rStyle w:val="IndexLink"/>
               </w:rPr>
               <w:tab/>
-              <w:t>45</w:t>
+              <w:t>44</w:t>
             </w:r>
           </w:hyperlink>
         </w:p>
@@ -1262,7 +1262,7 @@
             </w:tabs>
             <w:rPr/>
           </w:pPr>
-          <w:hyperlink w:anchor="__RefHeading___Toc5279_3488861905">
+          <w:hyperlink w:anchor="__RefHeading___Toc5279_1888984076">
             <w:r>
               <w:rPr>
                 <w:webHidden/>
@@ -1276,7 +1276,7 @@
                 <w:rStyle w:val="IndexLink"/>
               </w:rPr>
               <w:tab/>
-              <w:t>46</w:t>
+              <w:t>45</w:t>
             </w:r>
           </w:hyperlink>
         </w:p>
@@ -1289,7 +1289,7 @@
             </w:tabs>
             <w:rPr/>
           </w:pPr>
-          <w:hyperlink w:anchor="__RefHeading___Toc5281_3488861905">
+          <w:hyperlink w:anchor="__RefHeading___Toc5281_1888984076">
             <w:r>
               <w:rPr>
                 <w:webHidden/>
@@ -1303,7 +1303,7 @@
                 <w:rStyle w:val="IndexLink"/>
               </w:rPr>
               <w:tab/>
-              <w:t>47</w:t>
+              <w:t>46</w:t>
             </w:r>
           </w:hyperlink>
         </w:p>
@@ -1316,7 +1316,7 @@
             </w:tabs>
             <w:rPr/>
           </w:pPr>
-          <w:hyperlink w:anchor="__RefHeading___Toc5283_3488861905">
+          <w:hyperlink w:anchor="__RefHeading___Toc5283_1888984076">
             <w:r>
               <w:rPr>
                 <w:webHidden/>
@@ -1330,7 +1330,7 @@
                 <w:rStyle w:val="IndexLink"/>
               </w:rPr>
               <w:tab/>
-              <w:t>48</w:t>
+              <w:t>47</w:t>
             </w:r>
           </w:hyperlink>
         </w:p>
@@ -1343,7 +1343,7 @@
             </w:tabs>
             <w:rPr/>
           </w:pPr>
-          <w:hyperlink w:anchor="__RefHeading___Toc5285_3488861905">
+          <w:hyperlink w:anchor="__RefHeading___Toc5285_1888984076">
             <w:r>
               <w:rPr>
                 <w:webHidden/>
@@ -1357,7 +1357,7 @@
                 <w:rStyle w:val="IndexLink"/>
               </w:rPr>
               <w:tab/>
-              <w:t>51</w:t>
+              <w:t>50</w:t>
             </w:r>
           </w:hyperlink>
         </w:p>
@@ -1370,7 +1370,7 @@
             </w:tabs>
             <w:rPr/>
           </w:pPr>
-          <w:hyperlink w:anchor="__RefHeading___Toc5287_3488861905">
+          <w:hyperlink w:anchor="__RefHeading___Toc5287_1888984076">
             <w:r>
               <w:rPr>
                 <w:webHidden/>
@@ -1384,7 +1384,7 @@
                 <w:rStyle w:val="IndexLink"/>
               </w:rPr>
               <w:tab/>
-              <w:t>51</w:t>
+              <w:t>50</w:t>
             </w:r>
           </w:hyperlink>
         </w:p>
@@ -1397,7 +1397,7 @@
             </w:tabs>
             <w:rPr/>
           </w:pPr>
-          <w:hyperlink w:anchor="__RefHeading___Toc5289_3488861905">
+          <w:hyperlink w:anchor="__RefHeading___Toc5289_1888984076">
             <w:r>
               <w:rPr>
                 <w:webHidden/>
@@ -1411,7 +1411,7 @@
                 <w:rStyle w:val="IndexLink"/>
               </w:rPr>
               <w:tab/>
-              <w:t>52</w:t>
+              <w:t>51</w:t>
             </w:r>
           </w:hyperlink>
         </w:p>
@@ -1424,7 +1424,7 @@
             </w:tabs>
             <w:rPr/>
           </w:pPr>
-          <w:hyperlink w:anchor="__RefHeading___Toc5291_3488861905">
+          <w:hyperlink w:anchor="__RefHeading___Toc5291_1888984076">
             <w:r>
               <w:rPr>
                 <w:webHidden/>
@@ -1438,7 +1438,7 @@
                 <w:rStyle w:val="IndexLink"/>
               </w:rPr>
               <w:tab/>
-              <w:t>52</w:t>
+              <w:t>51</w:t>
             </w:r>
           </w:hyperlink>
         </w:p>
@@ -1451,7 +1451,7 @@
             </w:tabs>
             <w:rPr/>
           </w:pPr>
-          <w:hyperlink w:anchor="__RefHeading___Toc5293_3488861905">
+          <w:hyperlink w:anchor="__RefHeading___Toc5293_1888984076">
             <w:r>
               <w:rPr>
                 <w:webHidden/>
@@ -1465,7 +1465,7 @@
                 <w:rStyle w:val="IndexLink"/>
               </w:rPr>
               <w:tab/>
-              <w:t>53</w:t>
+              <w:t>52</w:t>
             </w:r>
           </w:hyperlink>
         </w:p>
@@ -1478,7 +1478,7 @@
             </w:tabs>
             <w:rPr/>
           </w:pPr>
-          <w:hyperlink w:anchor="__RefHeading___Toc5295_3488861905">
+          <w:hyperlink w:anchor="__RefHeading___Toc5295_1888984076">
             <w:r>
               <w:rPr>
                 <w:webHidden/>
@@ -1492,7 +1492,7 @@
                 <w:rStyle w:val="IndexLink"/>
               </w:rPr>
               <w:tab/>
-              <w:t>54</w:t>
+              <w:t>53</w:t>
             </w:r>
           </w:hyperlink>
         </w:p>
@@ -1505,7 +1505,7 @@
             </w:tabs>
             <w:rPr/>
           </w:pPr>
-          <w:hyperlink w:anchor="__RefHeading___Toc5297_3488861905">
+          <w:hyperlink w:anchor="__RefHeading___Toc5297_1888984076">
             <w:r>
               <w:rPr>
                 <w:webHidden/>
@@ -1519,7 +1519,7 @@
                 <w:rStyle w:val="IndexLink"/>
               </w:rPr>
               <w:tab/>
-              <w:t>54</w:t>
+              <w:t>53</w:t>
             </w:r>
           </w:hyperlink>
         </w:p>
@@ -1532,7 +1532,7 @@
             </w:tabs>
             <w:rPr/>
           </w:pPr>
-          <w:hyperlink w:anchor="__RefHeading___Toc5299_3488861905">
+          <w:hyperlink w:anchor="__RefHeading___Toc5299_1888984076">
             <w:r>
               <w:rPr>
                 <w:webHidden/>
@@ -1546,7 +1546,7 @@
                 <w:rStyle w:val="IndexLink"/>
               </w:rPr>
               <w:tab/>
-              <w:t>59</w:t>
+              <w:t>58</w:t>
             </w:r>
           </w:hyperlink>
         </w:p>
@@ -1559,7 +1559,7 @@
             </w:tabs>
             <w:rPr/>
           </w:pPr>
-          <w:hyperlink w:anchor="__RefHeading___Toc5301_3488861905">
+          <w:hyperlink w:anchor="__RefHeading___Toc5301_1888984076">
             <w:r>
               <w:rPr>
                 <w:webHidden/>
@@ -1573,7 +1573,7 @@
                 <w:rStyle w:val="IndexLink"/>
               </w:rPr>
               <w:tab/>
-              <w:t>59</w:t>
+              <w:t>58</w:t>
             </w:r>
           </w:hyperlink>
         </w:p>
@@ -1586,7 +1586,7 @@
             </w:tabs>
             <w:rPr/>
           </w:pPr>
-          <w:hyperlink w:anchor="__RefHeading___Toc5303_3488861905">
+          <w:hyperlink w:anchor="__RefHeading___Toc5303_1888984076">
             <w:r>
               <w:rPr>
                 <w:webHidden/>
@@ -1600,7 +1600,7 @@
                 <w:rStyle w:val="IndexLink"/>
               </w:rPr>
               <w:tab/>
-              <w:t>60</w:t>
+              <w:t>59</w:t>
             </w:r>
           </w:hyperlink>
         </w:p>
@@ -1613,7 +1613,7 @@
             </w:tabs>
             <w:rPr/>
           </w:pPr>
-          <w:hyperlink w:anchor="__RefHeading___Toc5305_3488861905">
+          <w:hyperlink w:anchor="__RefHeading___Toc5305_1888984076">
             <w:r>
               <w:rPr>
                 <w:webHidden/>
@@ -1627,7 +1627,7 @@
                 <w:rStyle w:val="IndexLink"/>
               </w:rPr>
               <w:tab/>
-              <w:t>60</w:t>
+              <w:t>59</w:t>
             </w:r>
           </w:hyperlink>
         </w:p>
@@ -1640,7 +1640,7 @@
             </w:tabs>
             <w:rPr/>
           </w:pPr>
-          <w:hyperlink w:anchor="__RefHeading___Toc5307_3488861905">
+          <w:hyperlink w:anchor="__RefHeading___Toc5307_1888984076">
             <w:r>
               <w:rPr>
                 <w:webHidden/>
@@ -1654,7 +1654,7 @@
                 <w:rStyle w:val="IndexLink"/>
               </w:rPr>
               <w:tab/>
-              <w:t>60</w:t>
+              <w:t>59</w:t>
             </w:r>
           </w:hyperlink>
         </w:p>
@@ -1667,7 +1667,7 @@
             </w:tabs>
             <w:rPr/>
           </w:pPr>
-          <w:hyperlink w:anchor="__RefHeading___Toc5309_3488861905">
+          <w:hyperlink w:anchor="__RefHeading___Toc5309_1888984076">
             <w:r>
               <w:rPr>
                 <w:webHidden/>
@@ -1681,7 +1681,7 @@
                 <w:rStyle w:val="IndexLink"/>
               </w:rPr>
               <w:tab/>
-              <w:t>62</w:t>
+              <w:t>61</w:t>
             </w:r>
           </w:hyperlink>
         </w:p>
@@ -1694,7 +1694,7 @@
             </w:tabs>
             <w:rPr/>
           </w:pPr>
-          <w:hyperlink w:anchor="__RefHeading___Toc5311_3488861905">
+          <w:hyperlink w:anchor="__RefHeading___Toc5311_1888984076">
             <w:r>
               <w:rPr>
                 <w:webHidden/>
@@ -1708,7 +1708,7 @@
                 <w:rStyle w:val="IndexLink"/>
               </w:rPr>
               <w:tab/>
-              <w:t>63</w:t>
+              <w:t>62</w:t>
             </w:r>
           </w:hyperlink>
         </w:p>
@@ -1721,7 +1721,7 @@
             </w:tabs>
             <w:rPr/>
           </w:pPr>
-          <w:hyperlink w:anchor="__RefHeading___Toc5313_3488861905">
+          <w:hyperlink w:anchor="__RefHeading___Toc5313_1888984076">
             <w:r>
               <w:rPr>
                 <w:webHidden/>
@@ -1735,7 +1735,7 @@
                 <w:rStyle w:val="IndexLink"/>
               </w:rPr>
               <w:tab/>
-              <w:t>65</w:t>
+              <w:t>64</w:t>
             </w:r>
           </w:hyperlink>
         </w:p>
@@ -1748,7 +1748,7 @@
             </w:tabs>
             <w:rPr/>
           </w:pPr>
-          <w:hyperlink w:anchor="__RefHeading___Toc5315_3488861905">
+          <w:hyperlink w:anchor="__RefHeading___Toc5315_1888984076">
             <w:r>
               <w:rPr>
                 <w:webHidden/>
@@ -1762,7 +1762,7 @@
                 <w:rStyle w:val="IndexLink"/>
               </w:rPr>
               <w:tab/>
-              <w:t>68</w:t>
+              <w:t>67</w:t>
             </w:r>
           </w:hyperlink>
         </w:p>
@@ -1775,7 +1775,7 @@
             </w:tabs>
             <w:rPr/>
           </w:pPr>
-          <w:hyperlink w:anchor="__RefHeading___Toc5317_3488861905">
+          <w:hyperlink w:anchor="__RefHeading___Toc5317_1888984076">
             <w:r>
               <w:rPr>
                 <w:webHidden/>
@@ -1789,7 +1789,7 @@
                 <w:rStyle w:val="IndexLink"/>
               </w:rPr>
               <w:tab/>
-              <w:t>68</w:t>
+              <w:t>67</w:t>
             </w:r>
           </w:hyperlink>
         </w:p>
@@ -1802,7 +1802,7 @@
             </w:tabs>
             <w:rPr/>
           </w:pPr>
-          <w:hyperlink w:anchor="__RefHeading___Toc5319_3488861905">
+          <w:hyperlink w:anchor="__RefHeading___Toc5319_1888984076">
             <w:r>
               <w:rPr>
                 <w:webHidden/>
@@ -1816,7 +1816,7 @@
                 <w:rStyle w:val="IndexLink"/>
               </w:rPr>
               <w:tab/>
-              <w:t>69</w:t>
+              <w:t>68</w:t>
             </w:r>
           </w:hyperlink>
         </w:p>
@@ -1829,7 +1829,7 @@
             </w:tabs>
             <w:rPr/>
           </w:pPr>
-          <w:hyperlink w:anchor="__RefHeading___Toc5321_3488861905">
+          <w:hyperlink w:anchor="__RefHeading___Toc5321_1888984076">
             <w:r>
               <w:rPr>
                 <w:webHidden/>
@@ -1843,7 +1843,7 @@
                 <w:rStyle w:val="IndexLink"/>
               </w:rPr>
               <w:tab/>
-              <w:t>69</w:t>
+              <w:t>68</w:t>
             </w:r>
           </w:hyperlink>
         </w:p>
@@ -1856,7 +1856,7 @@
             </w:tabs>
             <w:rPr/>
           </w:pPr>
-          <w:hyperlink w:anchor="__RefHeading___Toc5323_3488861905">
+          <w:hyperlink w:anchor="__RefHeading___Toc5323_1888984076">
             <w:r>
               <w:rPr>
                 <w:webHidden/>
@@ -1870,7 +1870,7 @@
                 <w:rStyle w:val="IndexLink"/>
               </w:rPr>
               <w:tab/>
-              <w:t>70</w:t>
+              <w:t>69</w:t>
             </w:r>
           </w:hyperlink>
         </w:p>
@@ -1883,7 +1883,7 @@
             </w:tabs>
             <w:rPr/>
           </w:pPr>
-          <w:hyperlink w:anchor="__RefHeading___Toc5325_3488861905">
+          <w:hyperlink w:anchor="__RefHeading___Toc5325_1888984076">
             <w:r>
               <w:rPr>
                 <w:webHidden/>
@@ -1897,7 +1897,7 @@
                 <w:rStyle w:val="IndexLink"/>
               </w:rPr>
               <w:tab/>
-              <w:t>71</w:t>
+              <w:t>70</w:t>
             </w:r>
           </w:hyperlink>
         </w:p>
@@ -1910,7 +1910,7 @@
             </w:tabs>
             <w:rPr/>
           </w:pPr>
-          <w:hyperlink w:anchor="__RefHeading___Toc5327_3488861905">
+          <w:hyperlink w:anchor="__RefHeading___Toc5327_1888984076">
             <w:r>
               <w:rPr>
                 <w:webHidden/>
@@ -1924,7 +1924,7 @@
                 <w:rStyle w:val="IndexLink"/>
               </w:rPr>
               <w:tab/>
-              <w:t>71</w:t>
+              <w:t>70</w:t>
             </w:r>
           </w:hyperlink>
         </w:p>
@@ -1937,7 +1937,7 @@
             </w:tabs>
             <w:rPr/>
           </w:pPr>
-          <w:hyperlink w:anchor="__RefHeading___Toc5329_3488861905">
+          <w:hyperlink w:anchor="__RefHeading___Toc5329_1888984076">
             <w:r>
               <w:rPr>
                 <w:webHidden/>
@@ -1951,7 +1951,7 @@
                 <w:rStyle w:val="IndexLink"/>
               </w:rPr>
               <w:tab/>
-              <w:t>73</w:t>
+              <w:t>72</w:t>
             </w:r>
           </w:hyperlink>
         </w:p>
@@ -1964,7 +1964,7 @@
             </w:tabs>
             <w:rPr/>
           </w:pPr>
-          <w:hyperlink w:anchor="__RefHeading___Toc5331_3488861905">
+          <w:hyperlink w:anchor="__RefHeading___Toc5331_1888984076">
             <w:r>
               <w:rPr>
                 <w:webHidden/>
@@ -1978,7 +1978,7 @@
                 <w:rStyle w:val="IndexLink"/>
               </w:rPr>
               <w:tab/>
-              <w:t>77</w:t>
+              <w:t>76</w:t>
             </w:r>
           </w:hyperlink>
         </w:p>
@@ -1991,7 +1991,7 @@
             </w:tabs>
             <w:rPr/>
           </w:pPr>
-          <w:hyperlink w:anchor="__RefHeading___Toc5333_3488861905">
+          <w:hyperlink w:anchor="__RefHeading___Toc5333_1888984076">
             <w:r>
               <w:rPr>
                 <w:webHidden/>
@@ -2005,7 +2005,7 @@
                 <w:rStyle w:val="IndexLink"/>
               </w:rPr>
               <w:tab/>
-              <w:t>77</w:t>
+              <w:t>76</w:t>
             </w:r>
           </w:hyperlink>
         </w:p>
@@ -2018,7 +2018,7 @@
             </w:tabs>
             <w:rPr/>
           </w:pPr>
-          <w:hyperlink w:anchor="__RefHeading___Toc5335_3488861905">
+          <w:hyperlink w:anchor="__RefHeading___Toc5335_1888984076">
             <w:r>
               <w:rPr>
                 <w:webHidden/>
@@ -2032,7 +2032,7 @@
                 <w:rStyle w:val="IndexLink"/>
               </w:rPr>
               <w:tab/>
-              <w:t>78</w:t>
+              <w:t>77</w:t>
             </w:r>
           </w:hyperlink>
         </w:p>
@@ -2045,7 +2045,7 @@
             </w:tabs>
             <w:rPr/>
           </w:pPr>
-          <w:hyperlink w:anchor="__RefHeading___Toc5337_3488861905">
+          <w:hyperlink w:anchor="__RefHeading___Toc5337_1888984076">
             <w:r>
               <w:rPr>
                 <w:webHidden/>
@@ -2059,7 +2059,7 @@
                 <w:rStyle w:val="IndexLink"/>
               </w:rPr>
               <w:tab/>
-              <w:t>78</w:t>
+              <w:t>77</w:t>
             </w:r>
           </w:hyperlink>
         </w:p>
@@ -2072,7 +2072,7 @@
             </w:tabs>
             <w:rPr/>
           </w:pPr>
-          <w:hyperlink w:anchor="__RefHeading___Toc5339_3488861905">
+          <w:hyperlink w:anchor="__RefHeading___Toc5339_1888984076">
             <w:r>
               <w:rPr>
                 <w:webHidden/>
@@ -2086,7 +2086,7 @@
                 <w:rStyle w:val="IndexLink"/>
               </w:rPr>
               <w:tab/>
-              <w:t>80</w:t>
+              <w:t>79</w:t>
             </w:r>
           </w:hyperlink>
         </w:p>
@@ -2099,7 +2099,7 @@
             </w:tabs>
             <w:rPr/>
           </w:pPr>
-          <w:hyperlink w:anchor="__RefHeading___Toc5341_3488861905">
+          <w:hyperlink w:anchor="__RefHeading___Toc5341_1888984076">
             <w:r>
               <w:rPr>
                 <w:webHidden/>
@@ -2113,7 +2113,7 @@
                 <w:rStyle w:val="IndexLink"/>
               </w:rPr>
               <w:tab/>
-              <w:t>81</w:t>
+              <w:t>80</w:t>
             </w:r>
           </w:hyperlink>
         </w:p>
@@ -2126,7 +2126,7 @@
             </w:tabs>
             <w:rPr/>
           </w:pPr>
-          <w:hyperlink w:anchor="__RefHeading___Toc5343_3488861905">
+          <w:hyperlink w:anchor="__RefHeading___Toc5343_1888984076">
             <w:r>
               <w:rPr>
                 <w:webHidden/>
@@ -2140,7 +2140,7 @@
                 <w:rStyle w:val="IndexLink"/>
               </w:rPr>
               <w:tab/>
-              <w:t>82</w:t>
+              <w:t>81</w:t>
             </w:r>
           </w:hyperlink>
         </w:p>
@@ -2153,7 +2153,7 @@
             </w:tabs>
             <w:rPr/>
           </w:pPr>
-          <w:hyperlink w:anchor="__RefHeading___Toc5345_3488861905">
+          <w:hyperlink w:anchor="__RefHeading___Toc5345_1888984076">
             <w:r>
               <w:rPr>
                 <w:webHidden/>
@@ -2167,7 +2167,7 @@
                 <w:rStyle w:val="IndexLink"/>
               </w:rPr>
               <w:tab/>
-              <w:t>83</w:t>
+              <w:t>82</w:t>
             </w:r>
           </w:hyperlink>
         </w:p>
@@ -2180,7 +2180,7 @@
             </w:tabs>
             <w:rPr/>
           </w:pPr>
-          <w:hyperlink w:anchor="__RefHeading___Toc5347_3488861905">
+          <w:hyperlink w:anchor="__RefHeading___Toc5347_1888984076">
             <w:r>
               <w:rPr>
                 <w:webHidden/>
@@ -2194,7 +2194,7 @@
                 <w:rStyle w:val="IndexLink"/>
               </w:rPr>
               <w:tab/>
-              <w:t>86</w:t>
+              <w:t>85</w:t>
             </w:r>
           </w:hyperlink>
         </w:p>
@@ -2207,7 +2207,7 @@
             </w:tabs>
             <w:rPr/>
           </w:pPr>
-          <w:hyperlink w:anchor="__RefHeading___Toc5349_3488861905">
+          <w:hyperlink w:anchor="__RefHeading___Toc5349_1888984076">
             <w:r>
               <w:rPr>
                 <w:webHidden/>
@@ -2221,7 +2221,7 @@
                 <w:rStyle w:val="IndexLink"/>
               </w:rPr>
               <w:tab/>
-              <w:t>86</w:t>
+              <w:t>85</w:t>
             </w:r>
           </w:hyperlink>
         </w:p>
@@ -2234,7 +2234,7 @@
             </w:tabs>
             <w:rPr/>
           </w:pPr>
-          <w:hyperlink w:anchor="__RefHeading___Toc5351_3488861905">
+          <w:hyperlink w:anchor="__RefHeading___Toc5351_1888984076">
             <w:r>
               <w:rPr>
                 <w:webHidden/>
@@ -2248,7 +2248,7 @@
                 <w:rStyle w:val="IndexLink"/>
               </w:rPr>
               <w:tab/>
-              <w:t>87</w:t>
+              <w:t>86</w:t>
             </w:r>
           </w:hyperlink>
         </w:p>
@@ -2261,7 +2261,7 @@
             </w:tabs>
             <w:rPr/>
           </w:pPr>
-          <w:hyperlink w:anchor="__RefHeading___Toc5353_3488861905">
+          <w:hyperlink w:anchor="__RefHeading___Toc5353_1888984076">
             <w:r>
               <w:rPr>
                 <w:webHidden/>
@@ -2275,7 +2275,7 @@
                 <w:rStyle w:val="IndexLink"/>
               </w:rPr>
               <w:tab/>
-              <w:t>88</w:t>
+              <w:t>87</w:t>
             </w:r>
           </w:hyperlink>
         </w:p>
@@ -2288,7 +2288,7 @@
             </w:tabs>
             <w:rPr/>
           </w:pPr>
-          <w:hyperlink w:anchor="__RefHeading___Toc5355_3488861905">
+          <w:hyperlink w:anchor="__RefHeading___Toc5355_1888984076">
             <w:r>
               <w:rPr>
                 <w:webHidden/>
@@ -2302,7 +2302,7 @@
                 <w:rStyle w:val="IndexLink"/>
               </w:rPr>
               <w:tab/>
-              <w:t>89</w:t>
+              <w:t>88</w:t>
             </w:r>
           </w:hyperlink>
         </w:p>
@@ -2315,7 +2315,7 @@
             </w:tabs>
             <w:rPr/>
           </w:pPr>
-          <w:hyperlink w:anchor="__RefHeading___Toc5357_3488861905">
+          <w:hyperlink w:anchor="__RefHeading___Toc5357_1888984076">
             <w:r>
               <w:rPr>
                 <w:webHidden/>
@@ -2329,7 +2329,7 @@
                 <w:rStyle w:val="IndexLink"/>
               </w:rPr>
               <w:tab/>
-              <w:t>89</w:t>
+              <w:t>88</w:t>
             </w:r>
           </w:hyperlink>
         </w:p>
@@ -2342,7 +2342,7 @@
             </w:tabs>
             <w:rPr/>
           </w:pPr>
-          <w:hyperlink w:anchor="__RefHeading___Toc5359_3488861905">
+          <w:hyperlink w:anchor="__RefHeading___Toc5359_1888984076">
             <w:r>
               <w:rPr>
                 <w:webHidden/>
@@ -2356,7 +2356,7 @@
                 <w:rStyle w:val="IndexLink"/>
               </w:rPr>
               <w:tab/>
-              <w:t>90</w:t>
+              <w:t>89</w:t>
             </w:r>
           </w:hyperlink>
         </w:p>
@@ -2369,7 +2369,7 @@
             </w:tabs>
             <w:rPr/>
           </w:pPr>
-          <w:hyperlink w:anchor="__RefHeading___Toc5361_3488861905">
+          <w:hyperlink w:anchor="__RefHeading___Toc5361_1888984076">
             <w:r>
               <w:rPr>
                 <w:webHidden/>
@@ -2383,7 +2383,7 @@
                 <w:rStyle w:val="IndexLink"/>
               </w:rPr>
               <w:tab/>
-              <w:t>94</w:t>
+              <w:t>93</w:t>
             </w:r>
           </w:hyperlink>
         </w:p>
@@ -2396,7 +2396,7 @@
             </w:tabs>
             <w:rPr/>
           </w:pPr>
-          <w:hyperlink w:anchor="__RefHeading___Toc5363_3488861905">
+          <w:hyperlink w:anchor="__RefHeading___Toc5363_1888984076">
             <w:r>
               <w:rPr>
                 <w:webHidden/>
@@ -2410,7 +2410,7 @@
                 <w:rStyle w:val="IndexLink"/>
               </w:rPr>
               <w:tab/>
-              <w:t>94</w:t>
+              <w:t>93</w:t>
             </w:r>
           </w:hyperlink>
         </w:p>
@@ -2423,7 +2423,7 @@
             </w:tabs>
             <w:rPr/>
           </w:pPr>
-          <w:hyperlink w:anchor="__RefHeading___Toc5365_3488861905">
+          <w:hyperlink w:anchor="__RefHeading___Toc5365_1888984076">
             <w:r>
               <w:rPr>
                 <w:webHidden/>
@@ -2437,7 +2437,7 @@
                 <w:rStyle w:val="IndexLink"/>
               </w:rPr>
               <w:tab/>
-              <w:t>95</w:t>
+              <w:t>94</w:t>
             </w:r>
           </w:hyperlink>
         </w:p>
@@ -2450,7 +2450,7 @@
             </w:tabs>
             <w:rPr/>
           </w:pPr>
-          <w:hyperlink w:anchor="__RefHeading___Toc5367_3488861905">
+          <w:hyperlink w:anchor="__RefHeading___Toc5367_1888984076">
             <w:r>
               <w:rPr>
                 <w:webHidden/>
@@ -2464,7 +2464,7 @@
                 <w:rStyle w:val="IndexLink"/>
               </w:rPr>
               <w:tab/>
-              <w:t>95</w:t>
+              <w:t>94</w:t>
             </w:r>
           </w:hyperlink>
         </w:p>
@@ -2477,7 +2477,7 @@
             </w:tabs>
             <w:rPr/>
           </w:pPr>
-          <w:hyperlink w:anchor="__RefHeading___Toc5369_3488861905">
+          <w:hyperlink w:anchor="__RefHeading___Toc5369_1888984076">
             <w:r>
               <w:rPr>
                 <w:webHidden/>
@@ -2491,7 +2491,7 @@
                 <w:rStyle w:val="IndexLink"/>
               </w:rPr>
               <w:tab/>
-              <w:t>96</w:t>
+              <w:t>95</w:t>
             </w:r>
           </w:hyperlink>
         </w:p>
@@ -2504,7 +2504,7 @@
             </w:tabs>
             <w:rPr/>
           </w:pPr>
-          <w:hyperlink w:anchor="__RefHeading___Toc5371_3488861905">
+          <w:hyperlink w:anchor="__RefHeading___Toc5371_1888984076">
             <w:r>
               <w:rPr>
                 <w:webHidden/>
@@ -2518,7 +2518,7 @@
                 <w:rStyle w:val="IndexLink"/>
               </w:rPr>
               <w:tab/>
-              <w:t>98</w:t>
+              <w:t>97</w:t>
             </w:r>
           </w:hyperlink>
         </w:p>
@@ -2531,7 +2531,7 @@
             </w:tabs>
             <w:rPr/>
           </w:pPr>
-          <w:hyperlink w:anchor="__RefHeading___Toc5373_3488861905">
+          <w:hyperlink w:anchor="__RefHeading___Toc5373_1888984076">
             <w:r>
               <w:rPr>
                 <w:webHidden/>
@@ -2545,7 +2545,7 @@
                 <w:rStyle w:val="IndexLink"/>
               </w:rPr>
               <w:tab/>
-              <w:t>99</w:t>
+              <w:t>98</w:t>
             </w:r>
           </w:hyperlink>
         </w:p>
@@ -2558,7 +2558,7 @@
             </w:tabs>
             <w:rPr/>
           </w:pPr>
-          <w:hyperlink w:anchor="__RefHeading___Toc5375_3488861905">
+          <w:hyperlink w:anchor="__RefHeading___Toc5375_1888984076">
             <w:r>
               <w:rPr>
                 <w:webHidden/>
@@ -2572,7 +2572,7 @@
                 <w:rStyle w:val="IndexLink"/>
               </w:rPr>
               <w:tab/>
-              <w:t>101</w:t>
+              <w:t>100</w:t>
             </w:r>
           </w:hyperlink>
         </w:p>
@@ -2585,7 +2585,7 @@
             </w:tabs>
             <w:rPr/>
           </w:pPr>
-          <w:hyperlink w:anchor="__RefHeading___Toc5377_3488861905">
+          <w:hyperlink w:anchor="__RefHeading___Toc5377_1888984076">
             <w:r>
               <w:rPr>
                 <w:webHidden/>
@@ -2599,7 +2599,7 @@
                 <w:rStyle w:val="IndexLink"/>
               </w:rPr>
               <w:tab/>
-              <w:t>104</w:t>
+              <w:t>103</w:t>
             </w:r>
           </w:hyperlink>
         </w:p>
@@ -2612,7 +2612,7 @@
             </w:tabs>
             <w:rPr/>
           </w:pPr>
-          <w:hyperlink w:anchor="__RefHeading___Toc5379_3488861905">
+          <w:hyperlink w:anchor="__RefHeading___Toc5379_1888984076">
             <w:r>
               <w:rPr>
                 <w:webHidden/>
@@ -2626,7 +2626,7 @@
                 <w:rStyle w:val="IndexLink"/>
               </w:rPr>
               <w:tab/>
-              <w:t>106</w:t>
+              <w:t>105</w:t>
             </w:r>
           </w:hyperlink>
         </w:p>
@@ -2639,7 +2639,7 @@
             </w:tabs>
             <w:rPr/>
           </w:pPr>
-          <w:hyperlink w:anchor="__RefHeading___Toc5381_3488861905">
+          <w:hyperlink w:anchor="__RefHeading___Toc5381_1888984076">
             <w:r>
               <w:rPr>
                 <w:webHidden/>
@@ -2653,7 +2653,7 @@
                 <w:rStyle w:val="IndexLink"/>
               </w:rPr>
               <w:tab/>
-              <w:t>110</w:t>
+              <w:t>109</w:t>
             </w:r>
           </w:hyperlink>
         </w:p>
@@ -2666,7 +2666,7 @@
             </w:tabs>
             <w:rPr/>
           </w:pPr>
-          <w:hyperlink w:anchor="__RefHeading___Toc5383_3488861905">
+          <w:hyperlink w:anchor="__RefHeading___Toc5383_1888984076">
             <w:r>
               <w:rPr>
                 <w:webHidden/>
@@ -2680,7 +2680,7 @@
                 <w:rStyle w:val="IndexLink"/>
               </w:rPr>
               <w:tab/>
-              <w:t>110</w:t>
+              <w:t>109</w:t>
             </w:r>
           </w:hyperlink>
         </w:p>
@@ -2693,7 +2693,7 @@
             </w:tabs>
             <w:rPr/>
           </w:pPr>
-          <w:hyperlink w:anchor="__RefHeading___Toc5385_3488861905">
+          <w:hyperlink w:anchor="__RefHeading___Toc5385_1888984076">
             <w:r>
               <w:rPr>
                 <w:webHidden/>
@@ -2707,7 +2707,7 @@
                 <w:rStyle w:val="IndexLink"/>
               </w:rPr>
               <w:tab/>
-              <w:t>110</w:t>
+              <w:t>109</w:t>
             </w:r>
           </w:hyperlink>
         </w:p>
@@ -2720,7 +2720,7 @@
             </w:tabs>
             <w:rPr/>
           </w:pPr>
-          <w:hyperlink w:anchor="__RefHeading___Toc5387_3488861905">
+          <w:hyperlink w:anchor="__RefHeading___Toc5387_1888984076">
             <w:r>
               <w:rPr>
                 <w:webHidden/>
@@ -2734,7 +2734,7 @@
                 <w:rStyle w:val="IndexLink"/>
               </w:rPr>
               <w:tab/>
-              <w:t>111</w:t>
+              <w:t>110</w:t>
             </w:r>
           </w:hyperlink>
         </w:p>
@@ -2747,7 +2747,7 @@
             </w:tabs>
             <w:rPr/>
           </w:pPr>
-          <w:hyperlink w:anchor="__RefHeading___Toc5389_3488861905">
+          <w:hyperlink w:anchor="__RefHeading___Toc5389_1888984076">
             <w:r>
               <w:rPr>
                 <w:webHidden/>
@@ -2761,7 +2761,7 @@
                 <w:rStyle w:val="IndexLink"/>
               </w:rPr>
               <w:tab/>
-              <w:t>111</w:t>
+              <w:t>110</w:t>
             </w:r>
           </w:hyperlink>
         </w:p>
@@ -2774,7 +2774,7 @@
             </w:tabs>
             <w:rPr/>
           </w:pPr>
-          <w:hyperlink w:anchor="__RefHeading___Toc5391_3488861905">
+          <w:hyperlink w:anchor="__RefHeading___Toc5391_1888984076">
             <w:r>
               <w:rPr>
                 <w:webHidden/>
@@ -2788,7 +2788,7 @@
                 <w:rStyle w:val="IndexLink"/>
               </w:rPr>
               <w:tab/>
-              <w:t>111</w:t>
+              <w:t>110</w:t>
             </w:r>
           </w:hyperlink>
         </w:p>
@@ -2801,7 +2801,7 @@
             </w:tabs>
             <w:rPr/>
           </w:pPr>
-          <w:hyperlink w:anchor="__RefHeading___Toc5393_3488861905">
+          <w:hyperlink w:anchor="__RefHeading___Toc5393_1888984076">
             <w:r>
               <w:rPr>
                 <w:webHidden/>
@@ -2815,7 +2815,7 @@
                 <w:rStyle w:val="IndexLink"/>
               </w:rPr>
               <w:tab/>
-              <w:t>112</w:t>
+              <w:t>111</w:t>
             </w:r>
           </w:hyperlink>
         </w:p>
@@ -2828,7 +2828,7 @@
             </w:tabs>
             <w:rPr/>
           </w:pPr>
-          <w:hyperlink w:anchor="__RefHeading___Toc5395_3488861905">
+          <w:hyperlink w:anchor="__RefHeading___Toc5395_1888984076">
             <w:r>
               <w:rPr>
                 <w:webHidden/>
@@ -2842,7 +2842,7 @@
                 <w:rStyle w:val="IndexLink"/>
               </w:rPr>
               <w:tab/>
-              <w:t>113</w:t>
+              <w:t>112</w:t>
             </w:r>
           </w:hyperlink>
         </w:p>
@@ -2855,7 +2855,7 @@
             </w:tabs>
             <w:rPr/>
           </w:pPr>
-          <w:hyperlink w:anchor="__RefHeading___Toc5397_3488861905">
+          <w:hyperlink w:anchor="__RefHeading___Toc5397_1888984076">
             <w:r>
               <w:rPr>
                 <w:webHidden/>
@@ -2869,7 +2869,7 @@
                 <w:rStyle w:val="IndexLink"/>
               </w:rPr>
               <w:tab/>
-              <w:t>115</w:t>
+              <w:t>114</w:t>
             </w:r>
           </w:hyperlink>
         </w:p>
@@ -2882,7 +2882,7 @@
             </w:tabs>
             <w:rPr/>
           </w:pPr>
-          <w:hyperlink w:anchor="__RefHeading___Toc5399_3488861905">
+          <w:hyperlink w:anchor="__RefHeading___Toc5399_1888984076">
             <w:r>
               <w:rPr>
                 <w:webHidden/>
@@ -2896,7 +2896,7 @@
                 <w:rStyle w:val="IndexLink"/>
               </w:rPr>
               <w:tab/>
-              <w:t>116</w:t>
+              <w:t>115</w:t>
             </w:r>
           </w:hyperlink>
         </w:p>
@@ -2909,7 +2909,7 @@
             </w:tabs>
             <w:rPr/>
           </w:pPr>
-          <w:hyperlink w:anchor="__RefHeading___Toc5401_3488861905">
+          <w:hyperlink w:anchor="__RefHeading___Toc5401_1888984076">
             <w:r>
               <w:rPr>
                 <w:webHidden/>
@@ -2923,7 +2923,7 @@
                 <w:rStyle w:val="IndexLink"/>
               </w:rPr>
               <w:tab/>
-              <w:t>117</w:t>
+              <w:t>116</w:t>
             </w:r>
           </w:hyperlink>
         </w:p>
@@ -2936,7 +2936,7 @@
             </w:tabs>
             <w:rPr/>
           </w:pPr>
-          <w:hyperlink w:anchor="__RefHeading___Toc5403_3488861905">
+          <w:hyperlink w:anchor="__RefHeading___Toc5403_1888984076">
             <w:r>
               <w:rPr>
                 <w:webHidden/>
@@ -2950,7 +2950,7 @@
                 <w:rStyle w:val="IndexLink"/>
               </w:rPr>
               <w:tab/>
-              <w:t>119</w:t>
+              <w:t>118</w:t>
             </w:r>
           </w:hyperlink>
         </w:p>
@@ -2963,7 +2963,7 @@
             </w:tabs>
             <w:rPr/>
           </w:pPr>
-          <w:hyperlink w:anchor="__RefHeading___Toc5405_3488861905">
+          <w:hyperlink w:anchor="__RefHeading___Toc5405_1888984076">
             <w:r>
               <w:rPr>
                 <w:webHidden/>
@@ -2977,7 +2977,7 @@
                 <w:rStyle w:val="IndexLink"/>
               </w:rPr>
               <w:tab/>
-              <w:t>119</w:t>
+              <w:t>118</w:t>
             </w:r>
           </w:hyperlink>
         </w:p>
@@ -2990,7 +2990,7 @@
             </w:tabs>
             <w:rPr/>
           </w:pPr>
-          <w:hyperlink w:anchor="__RefHeading___Toc5407_3488861905">
+          <w:hyperlink w:anchor="__RefHeading___Toc5407_1888984076">
             <w:r>
               <w:rPr>
                 <w:webHidden/>
@@ -3004,7 +3004,7 @@
                 <w:rStyle w:val="IndexLink"/>
               </w:rPr>
               <w:tab/>
-              <w:t>119</w:t>
+              <w:t>118</w:t>
             </w:r>
           </w:hyperlink>
         </w:p>
@@ -3017,7 +3017,7 @@
             </w:tabs>
             <w:rPr/>
           </w:pPr>
-          <w:hyperlink w:anchor="__RefHeading___Toc5409_3488861905">
+          <w:hyperlink w:anchor="__RefHeading___Toc5409_1888984076">
             <w:r>
               <w:rPr>
                 <w:webHidden/>
@@ -3031,7 +3031,7 @@
                 <w:rStyle w:val="IndexLink"/>
               </w:rPr>
               <w:tab/>
-              <w:t>119</w:t>
+              <w:t>118</w:t>
             </w:r>
           </w:hyperlink>
         </w:p>
@@ -3044,7 +3044,7 @@
             </w:tabs>
             <w:rPr/>
           </w:pPr>
-          <w:hyperlink w:anchor="__RefHeading___Toc5411_3488861905">
+          <w:hyperlink w:anchor="__RefHeading___Toc5411_1888984076">
             <w:r>
               <w:rPr>
                 <w:webHidden/>
@@ -3058,7 +3058,7 @@
                 <w:rStyle w:val="IndexLink"/>
               </w:rPr>
               <w:tab/>
-              <w:t>120</w:t>
+              <w:t>119</w:t>
             </w:r>
           </w:hyperlink>
         </w:p>
@@ -3071,7 +3071,7 @@
             </w:tabs>
             <w:rPr/>
           </w:pPr>
-          <w:hyperlink w:anchor="__RefHeading___Toc5413_3488861905">
+          <w:hyperlink w:anchor="__RefHeading___Toc5413_1888984076">
             <w:r>
               <w:rPr>
                 <w:webHidden/>
@@ -3085,7 +3085,7 @@
                 <w:rStyle w:val="IndexLink"/>
               </w:rPr>
               <w:tab/>
-              <w:t>121</w:t>
+              <w:t>120</w:t>
             </w:r>
           </w:hyperlink>
           <w:r>
@@ -3126,7 +3126,7 @@
         <w:jc w:val="center"/>
         <w:rPr/>
       </w:pPr>
-      <w:bookmarkStart w:id="0" w:name="__RefHeading___Toc5225_3488861905"/>
+      <w:bookmarkStart w:id="0" w:name="__RefHeading___Toc5225_1888984076"/>
       <w:bookmarkEnd w:id="0"/>
       <w:r>
         <w:rPr>
@@ -3331,7 +3331,7 @@
         <w:jc w:val="center"/>
         <w:rPr/>
       </w:pPr>
-      <w:bookmarkStart w:id="1" w:name="__RefHeading___Toc5227_3488861905"/>
+      <w:bookmarkStart w:id="1" w:name="__RefHeading___Toc5227_1888984076"/>
       <w:bookmarkEnd w:id="1"/>
       <w:r>
         <w:rPr>
@@ -3636,7 +3636,7 @@
         <w:jc w:val="left"/>
         <w:rPr/>
       </w:pPr>
-      <w:bookmarkStart w:id="2" w:name="__RefHeading___Toc5229_3488861905"/>
+      <w:bookmarkStart w:id="2" w:name="__RefHeading___Toc5229_1888984076"/>
       <w:bookmarkEnd w:id="2"/>
       <w:r>
         <w:rPr>
@@ -3750,7 +3750,7 @@
         <w:jc w:val="left"/>
         <w:rPr/>
       </w:pPr>
-      <w:bookmarkStart w:id="3" w:name="__RefHeading___Toc5231_3488861905"/>
+      <w:bookmarkStart w:id="3" w:name="__RefHeading___Toc5231_1888984076"/>
       <w:bookmarkEnd w:id="3"/>
       <w:r>
         <w:rPr>
@@ -4055,7 +4055,7 @@
         <w:jc w:val="left"/>
         <w:rPr/>
       </w:pPr>
-      <w:bookmarkStart w:id="4" w:name="__RefHeading___Toc5233_3488861905"/>
+      <w:bookmarkStart w:id="4" w:name="__RefHeading___Toc5233_1888984076"/>
       <w:bookmarkEnd w:id="4"/>
       <w:r>
         <w:rPr>
@@ -4302,7 +4302,7 @@
         <w:jc w:val="left"/>
         <w:rPr/>
       </w:pPr>
-      <w:bookmarkStart w:id="5" w:name="__RefHeading___Toc5235_3488861905"/>
+      <w:bookmarkStart w:id="5" w:name="__RefHeading___Toc5235_1888984076"/>
       <w:bookmarkEnd w:id="5"/>
       <w:r>
         <w:rPr>
@@ -4566,7 +4566,7 @@
         <w:jc w:val="left"/>
         <w:rPr/>
       </w:pPr>
-      <w:bookmarkStart w:id="6" w:name="__RefHeading___Toc5237_3488861905"/>
+      <w:bookmarkStart w:id="6" w:name="__RefHeading___Toc5237_1888984076"/>
       <w:bookmarkEnd w:id="6"/>
       <w:r>
         <w:rPr>
@@ -4766,7 +4766,7 @@
         <w:jc w:val="left"/>
         <w:rPr/>
       </w:pPr>
-      <w:bookmarkStart w:id="7" w:name="__RefHeading___Toc5239_3488861905"/>
+      <w:bookmarkStart w:id="7" w:name="__RefHeading___Toc5239_1888984076"/>
       <w:bookmarkEnd w:id="7"/>
       <w:r>
         <w:rPr>
@@ -6514,7 +6514,7 @@
         <w:jc w:val="center"/>
         <w:rPr/>
       </w:pPr>
-      <w:bookmarkStart w:id="8" w:name="__RefHeading___Toc5241_3488861905"/>
+      <w:bookmarkStart w:id="8" w:name="__RefHeading___Toc5241_1888984076"/>
       <w:bookmarkEnd w:id="8"/>
       <w:r>
         <w:rPr>
@@ -6819,7 +6819,7 @@
         <w:jc w:val="left"/>
         <w:rPr/>
       </w:pPr>
-      <w:bookmarkStart w:id="9" w:name="__RefHeading___Toc5243_3488861905"/>
+      <w:bookmarkStart w:id="9" w:name="__RefHeading___Toc5243_1888984076"/>
       <w:bookmarkEnd w:id="9"/>
       <w:r>
         <w:rPr>
@@ -6875,7 +6875,7 @@
         <w:jc w:val="left"/>
         <w:rPr/>
       </w:pPr>
-      <w:bookmarkStart w:id="10" w:name="__RefHeading___Toc5245_3488861905"/>
+      <w:bookmarkStart w:id="10" w:name="__RefHeading___Toc5245_1888984076"/>
       <w:bookmarkEnd w:id="10"/>
       <w:r>
         <w:rPr>
@@ -6942,7 +6942,7 @@
         <w:jc w:val="left"/>
         <w:rPr/>
       </w:pPr>
-      <w:bookmarkStart w:id="11" w:name="__RefHeading___Toc5247_3488861905"/>
+      <w:bookmarkStart w:id="11" w:name="__RefHeading___Toc5247_1888984076"/>
       <w:bookmarkEnd w:id="11"/>
       <w:r>
         <w:rPr>
@@ -7058,7 +7058,7 @@
         <w:jc w:val="left"/>
         <w:rPr/>
       </w:pPr>
-      <w:bookmarkStart w:id="12" w:name="__RefHeading___Toc5249_3488861905"/>
+      <w:bookmarkStart w:id="12" w:name="__RefHeading___Toc5249_1888984076"/>
       <w:bookmarkEnd w:id="12"/>
       <w:r>
         <w:rPr>
@@ -7604,7 +7604,7 @@
         <w:jc w:val="left"/>
         <w:rPr/>
       </w:pPr>
-      <w:bookmarkStart w:id="13" w:name="__RefHeading___Toc5251_3488861905"/>
+      <w:bookmarkStart w:id="13" w:name="__RefHeading___Toc5251_1888984076"/>
       <w:bookmarkEnd w:id="13"/>
       <w:r>
         <w:rPr>
@@ -7803,7 +7803,7 @@
         <w:jc w:val="left"/>
         <w:rPr/>
       </w:pPr>
-      <w:bookmarkStart w:id="14" w:name="__RefHeading___Toc5253_3488861905"/>
+      <w:bookmarkStart w:id="14" w:name="__RefHeading___Toc5253_1888984076"/>
       <w:bookmarkEnd w:id="14"/>
       <w:r>
         <w:rPr>
@@ -9326,7 +9326,7 @@
         <w:jc w:val="center"/>
         <w:rPr/>
       </w:pPr>
-      <w:bookmarkStart w:id="15" w:name="__RefHeading___Toc5255_3488861905"/>
+      <w:bookmarkStart w:id="15" w:name="__RefHeading___Toc5255_1888984076"/>
       <w:bookmarkEnd w:id="15"/>
       <w:r>
         <w:rPr>
@@ -9631,7 +9631,7 @@
         <w:jc w:val="left"/>
         <w:rPr/>
       </w:pPr>
-      <w:bookmarkStart w:id="16" w:name="__RefHeading___Toc5257_3488861905"/>
+      <w:bookmarkStart w:id="16" w:name="__RefHeading___Toc5257_1888984076"/>
       <w:bookmarkEnd w:id="16"/>
       <w:r>
         <w:rPr>
@@ -9687,7 +9687,7 @@
         <w:jc w:val="left"/>
         <w:rPr/>
       </w:pPr>
-      <w:bookmarkStart w:id="17" w:name="__RefHeading___Toc5259_3488861905"/>
+      <w:bookmarkStart w:id="17" w:name="__RefHeading___Toc5259_1888984076"/>
       <w:bookmarkEnd w:id="17"/>
       <w:r>
         <w:rPr>
@@ -9927,7 +9927,7 @@
         <w:jc w:val="left"/>
         <w:rPr/>
       </w:pPr>
-      <w:bookmarkStart w:id="18" w:name="__RefHeading___Toc5261_3488861905"/>
+      <w:bookmarkStart w:id="18" w:name="__RefHeading___Toc5261_1888984076"/>
       <w:bookmarkEnd w:id="18"/>
       <w:r>
         <w:rPr>
@@ -10182,7 +10182,7 @@
         <w:jc w:val="left"/>
         <w:rPr/>
       </w:pPr>
-      <w:bookmarkStart w:id="19" w:name="__RefHeading___Toc5263_3488861905"/>
+      <w:bookmarkStart w:id="19" w:name="__RefHeading___Toc5263_1888984076"/>
       <w:bookmarkEnd w:id="19"/>
       <w:r>
         <w:rPr>
@@ -10400,7 +10400,7 @@
         <w:jc w:val="left"/>
         <w:rPr/>
       </w:pPr>
-      <w:bookmarkStart w:id="20" w:name="__RefHeading___Toc5265_3488861905"/>
+      <w:bookmarkStart w:id="20" w:name="__RefHeading___Toc5265_1888984076"/>
       <w:bookmarkEnd w:id="20"/>
       <w:r>
         <w:rPr>
@@ -10591,7 +10591,7 @@
         <w:jc w:val="left"/>
         <w:rPr/>
       </w:pPr>
-      <w:bookmarkStart w:id="21" w:name="__RefHeading___Toc5267_3488861905"/>
+      <w:bookmarkStart w:id="21" w:name="__RefHeading___Toc5267_1888984076"/>
       <w:bookmarkEnd w:id="21"/>
       <w:r>
         <w:rPr>
@@ -12149,7 +12149,7 @@
         <w:jc w:val="center"/>
         <w:rPr/>
       </w:pPr>
-      <w:bookmarkStart w:id="22" w:name="__RefHeading___Toc5269_3488861905"/>
+      <w:bookmarkStart w:id="22" w:name="__RefHeading___Toc5269_1888984076"/>
       <w:bookmarkEnd w:id="22"/>
       <w:r>
         <w:rPr>
@@ -12454,7 +12454,7 @@
         <w:jc w:val="left"/>
         <w:rPr/>
       </w:pPr>
-      <w:bookmarkStart w:id="23" w:name="__RefHeading___Toc5271_3488861905"/>
+      <w:bookmarkStart w:id="23" w:name="__RefHeading___Toc5271_1888984076"/>
       <w:bookmarkEnd w:id="23"/>
       <w:r>
         <w:rPr>
@@ -12726,7 +12726,7 @@
         <w:jc w:val="left"/>
         <w:rPr/>
       </w:pPr>
-      <w:bookmarkStart w:id="24" w:name="__RefHeading___Toc5273_3488861905"/>
+      <w:bookmarkStart w:id="24" w:name="__RefHeading___Toc5273_1888984076"/>
       <w:bookmarkEnd w:id="24"/>
       <w:r>
         <w:rPr>
@@ -13067,7 +13067,7 @@
         <w:jc w:val="left"/>
         <w:rPr/>
       </w:pPr>
-      <w:bookmarkStart w:id="25" w:name="__RefHeading___Toc5275_3488861905"/>
+      <w:bookmarkStart w:id="25" w:name="__RefHeading___Toc5275_1888984076"/>
       <w:bookmarkEnd w:id="25"/>
       <w:r>
         <w:rPr>
@@ -13249,7 +13249,7 @@
         <w:jc w:val="left"/>
         <w:rPr/>
       </w:pPr>
-      <w:bookmarkStart w:id="26" w:name="__RefHeading___Toc5277_3488861905"/>
+      <w:bookmarkStart w:id="26" w:name="__RefHeading___Toc5277_1888984076"/>
       <w:bookmarkEnd w:id="26"/>
       <w:r>
         <w:rPr>
@@ -13570,7 +13570,7 @@
         <w:jc w:val="left"/>
         <w:rPr/>
       </w:pPr>
-      <w:bookmarkStart w:id="27" w:name="__RefHeading___Toc5279_3488861905"/>
+      <w:bookmarkStart w:id="27" w:name="__RefHeading___Toc5279_1888984076"/>
       <w:bookmarkEnd w:id="27"/>
       <w:r>
         <w:rPr>
@@ -13788,7 +13788,7 @@
         <w:jc w:val="left"/>
         <w:rPr/>
       </w:pPr>
-      <w:bookmarkStart w:id="28" w:name="__RefHeading___Toc5281_3488861905"/>
+      <w:bookmarkStart w:id="28" w:name="__RefHeading___Toc5281_1888984076"/>
       <w:bookmarkEnd w:id="28"/>
       <w:r>
         <w:rPr>
@@ -14026,7 +14026,7 @@
         <w:jc w:val="left"/>
         <w:rPr/>
       </w:pPr>
-      <w:bookmarkStart w:id="29" w:name="__RefHeading___Toc5283_3488861905"/>
+      <w:bookmarkStart w:id="29" w:name="__RefHeading___Toc5283_1888984076"/>
       <w:bookmarkEnd w:id="29"/>
       <w:r>
         <w:rPr>
@@ -15416,7 +15416,7 @@
         <w:jc w:val="center"/>
         <w:rPr/>
       </w:pPr>
-      <w:bookmarkStart w:id="30" w:name="__RefHeading___Toc5285_3488861905"/>
+      <w:bookmarkStart w:id="30" w:name="__RefHeading___Toc5285_1888984076"/>
       <w:bookmarkEnd w:id="30"/>
       <w:r>
         <w:rPr>
@@ -15721,7 +15721,7 @@
         <w:jc w:val="left"/>
         <w:rPr/>
       </w:pPr>
-      <w:bookmarkStart w:id="31" w:name="__RefHeading___Toc5287_3488861905"/>
+      <w:bookmarkStart w:id="31" w:name="__RefHeading___Toc5287_1888984076"/>
       <w:bookmarkEnd w:id="31"/>
       <w:r>
         <w:rPr>
@@ -15777,7 +15777,7 @@
         <w:jc w:val="left"/>
         <w:rPr/>
       </w:pPr>
-      <w:bookmarkStart w:id="32" w:name="__RefHeading___Toc5289_3488861905"/>
+      <w:bookmarkStart w:id="32" w:name="__RefHeading___Toc5289_1888984076"/>
       <w:bookmarkEnd w:id="32"/>
       <w:r>
         <w:rPr>
@@ -15968,7 +15968,7 @@
         <w:jc w:val="left"/>
         <w:rPr/>
       </w:pPr>
-      <w:bookmarkStart w:id="33" w:name="__RefHeading___Toc5291_3488861905"/>
+      <w:bookmarkStart w:id="33" w:name="__RefHeading___Toc5291_1888984076"/>
       <w:bookmarkEnd w:id="33"/>
       <w:r>
         <w:rPr>
@@ -16367,7 +16367,7 @@
         <w:jc w:val="left"/>
         <w:rPr/>
       </w:pPr>
-      <w:bookmarkStart w:id="34" w:name="__RefHeading___Toc5293_3488861905"/>
+      <w:bookmarkStart w:id="34" w:name="__RefHeading___Toc5293_1888984076"/>
       <w:bookmarkEnd w:id="34"/>
       <w:r>
         <w:rPr>
@@ -16477,7 +16477,7 @@
         <w:jc w:val="left"/>
         <w:rPr/>
       </w:pPr>
-      <w:bookmarkStart w:id="35" w:name="__RefHeading___Toc5295_3488861905"/>
+      <w:bookmarkStart w:id="35" w:name="__RefHeading___Toc5295_1888984076"/>
       <w:bookmarkEnd w:id="35"/>
       <w:r>
         <w:rPr>
@@ -16641,7 +16641,7 @@
         <w:jc w:val="left"/>
         <w:rPr/>
       </w:pPr>
-      <w:bookmarkStart w:id="36" w:name="__RefHeading___Toc5297_3488861905"/>
+      <w:bookmarkStart w:id="36" w:name="__RefHeading___Toc5297_1888984076"/>
       <w:bookmarkEnd w:id="36"/>
       <w:r>
         <w:rPr>
@@ -18442,7 +18442,7 @@
         <w:jc w:val="center"/>
         <w:rPr/>
       </w:pPr>
-      <w:bookmarkStart w:id="37" w:name="__RefHeading___Toc5299_3488861905"/>
+      <w:bookmarkStart w:id="37" w:name="__RefHeading___Toc5299_1888984076"/>
       <w:bookmarkEnd w:id="37"/>
       <w:r>
         <w:rPr>
@@ -18747,7 +18747,7 @@
         <w:jc w:val="left"/>
         <w:rPr/>
       </w:pPr>
-      <w:bookmarkStart w:id="38" w:name="__RefHeading___Toc5301_3488861905"/>
+      <w:bookmarkStart w:id="38" w:name="__RefHeading___Toc5301_1888984076"/>
       <w:bookmarkEnd w:id="38"/>
       <w:r>
         <w:rPr>
@@ -18812,7 +18812,7 @@
         <w:jc w:val="left"/>
         <w:rPr/>
       </w:pPr>
-      <w:bookmarkStart w:id="39" w:name="__RefHeading___Toc5303_3488861905"/>
+      <w:bookmarkStart w:id="39" w:name="__RefHeading___Toc5303_1888984076"/>
       <w:bookmarkEnd w:id="39"/>
       <w:r>
         <w:rPr>
@@ -18868,7 +18868,7 @@
         <w:jc w:val="left"/>
         <w:rPr/>
       </w:pPr>
-      <w:bookmarkStart w:id="40" w:name="__RefHeading___Toc5305_3488861905"/>
+      <w:bookmarkStart w:id="40" w:name="__RefHeading___Toc5305_1888984076"/>
       <w:bookmarkEnd w:id="40"/>
       <w:r>
         <w:rPr>
@@ -18935,7 +18935,7 @@
         <w:jc w:val="left"/>
         <w:rPr/>
       </w:pPr>
-      <w:bookmarkStart w:id="41" w:name="__RefHeading___Toc5307_3488861905"/>
+      <w:bookmarkStart w:id="41" w:name="__RefHeading___Toc5307_1888984076"/>
       <w:bookmarkEnd w:id="41"/>
       <w:r>
         <w:rPr>
@@ -19114,7 +19114,7 @@
         <w:jc w:val="left"/>
         <w:rPr/>
       </w:pPr>
-      <w:bookmarkStart w:id="42" w:name="__RefHeading___Toc5309_3488861905"/>
+      <w:bookmarkStart w:id="42" w:name="__RefHeading___Toc5309_1888984076"/>
       <w:bookmarkEnd w:id="42"/>
       <w:r>
         <w:rPr>
@@ -19325,7 +19325,7 @@
         <w:jc w:val="left"/>
         <w:rPr/>
       </w:pPr>
-      <w:bookmarkStart w:id="43" w:name="__RefHeading___Toc5311_3488861905"/>
+      <w:bookmarkStart w:id="43" w:name="__RefHeading___Toc5311_1888984076"/>
       <w:bookmarkEnd w:id="43"/>
       <w:r>
         <w:rPr>
@@ -20384,7 +20384,7 @@
         <w:jc w:val="left"/>
         <w:rPr/>
       </w:pPr>
-      <w:bookmarkStart w:id="44" w:name="__RefHeading___Toc5313_3488861905"/>
+      <w:bookmarkStart w:id="44" w:name="__RefHeading___Toc5313_1888984076"/>
       <w:bookmarkEnd w:id="44"/>
       <w:r>
         <w:rPr>
@@ -21259,7 +21259,7 @@
         <w:jc w:val="center"/>
         <w:rPr/>
       </w:pPr>
-      <w:bookmarkStart w:id="45" w:name="__RefHeading___Toc5315_3488861905"/>
+      <w:bookmarkStart w:id="45" w:name="__RefHeading___Toc5315_1888984076"/>
       <w:bookmarkEnd w:id="45"/>
       <w:r>
         <w:rPr>
@@ -21564,7 +21564,7 @@
         <w:jc w:val="left"/>
         <w:rPr/>
       </w:pPr>
-      <w:bookmarkStart w:id="46" w:name="__RefHeading___Toc5317_3488861905"/>
+      <w:bookmarkStart w:id="46" w:name="__RefHeading___Toc5317_1888984076"/>
       <w:bookmarkEnd w:id="46"/>
       <w:r>
         <w:rPr>
@@ -21620,7 +21620,7 @@
         <w:jc w:val="left"/>
         <w:rPr/>
       </w:pPr>
-      <w:bookmarkStart w:id="47" w:name="__RefHeading___Toc5319_3488861905"/>
+      <w:bookmarkStart w:id="47" w:name="__RefHeading___Toc5319_1888984076"/>
       <w:bookmarkEnd w:id="47"/>
       <w:r>
         <w:rPr>
@@ -21838,7 +21838,7 @@
         <w:jc w:val="left"/>
         <w:rPr/>
       </w:pPr>
-      <w:bookmarkStart w:id="48" w:name="__RefHeading___Toc5321_3488861905"/>
+      <w:bookmarkStart w:id="48" w:name="__RefHeading___Toc5321_1888984076"/>
       <w:bookmarkEnd w:id="48"/>
       <w:r>
         <w:rPr>
@@ -22236,7 +22236,7 @@
         <w:jc w:val="left"/>
         <w:rPr/>
       </w:pPr>
-      <w:bookmarkStart w:id="49" w:name="__RefHeading___Toc5323_3488861905"/>
+      <w:bookmarkStart w:id="49" w:name="__RefHeading___Toc5323_1888984076"/>
       <w:bookmarkEnd w:id="49"/>
       <w:r>
         <w:rPr>
@@ -22436,7 +22436,7 @@
         <w:jc w:val="left"/>
         <w:rPr/>
       </w:pPr>
-      <w:bookmarkStart w:id="50" w:name="__RefHeading___Toc5325_3488861905"/>
+      <w:bookmarkStart w:id="50" w:name="__RefHeading___Toc5325_1888984076"/>
       <w:bookmarkEnd w:id="50"/>
       <w:r>
         <w:rPr>
@@ -22654,7 +22654,7 @@
         <w:jc w:val="left"/>
         <w:rPr/>
       </w:pPr>
-      <w:bookmarkStart w:id="51" w:name="__RefHeading___Toc5327_3488861905"/>
+      <w:bookmarkStart w:id="51" w:name="__RefHeading___Toc5327_1888984076"/>
       <w:bookmarkEnd w:id="51"/>
       <w:r>
         <w:rPr>
@@ -23719,7 +23719,7 @@
         <w:jc w:val="left"/>
         <w:rPr/>
       </w:pPr>
-      <w:bookmarkStart w:id="52" w:name="__RefHeading___Toc5329_3488861905"/>
+      <w:bookmarkStart w:id="52" w:name="__RefHeading___Toc5329_1888984076"/>
       <w:bookmarkEnd w:id="52"/>
       <w:r>
         <w:rPr>
@@ -24700,7 +24700,7 @@
         <w:jc w:val="center"/>
         <w:rPr/>
       </w:pPr>
-      <w:bookmarkStart w:id="53" w:name="__RefHeading___Toc5331_3488861905"/>
+      <w:bookmarkStart w:id="53" w:name="__RefHeading___Toc5331_1888984076"/>
       <w:bookmarkEnd w:id="53"/>
       <w:r>
         <w:rPr>
@@ -25005,7 +25005,7 @@
         <w:jc w:val="left"/>
         <w:rPr/>
       </w:pPr>
-      <w:bookmarkStart w:id="54" w:name="__RefHeading___Toc5333_3488861905"/>
+      <w:bookmarkStart w:id="54" w:name="__RefHeading___Toc5333_1888984076"/>
       <w:bookmarkEnd w:id="54"/>
       <w:r>
         <w:rPr>
@@ -25061,7 +25061,7 @@
         <w:jc w:val="left"/>
         <w:rPr/>
       </w:pPr>
-      <w:bookmarkStart w:id="55" w:name="__RefHeading___Toc5335_3488861905"/>
+      <w:bookmarkStart w:id="55" w:name="__RefHeading___Toc5335_1888984076"/>
       <w:bookmarkEnd w:id="55"/>
       <w:r>
         <w:rPr>
@@ -25279,7 +25279,7 @@
         <w:jc w:val="left"/>
         <w:rPr/>
       </w:pPr>
-      <w:bookmarkStart w:id="56" w:name="__RefHeading___Toc5337_3488861905"/>
+      <w:bookmarkStart w:id="56" w:name="__RefHeading___Toc5337_1888984076"/>
       <w:bookmarkEnd w:id="56"/>
       <w:r>
         <w:rPr>
@@ -25573,7 +25573,7 @@
         <w:jc w:val="left"/>
         <w:rPr/>
       </w:pPr>
-      <w:bookmarkStart w:id="57" w:name="__RefHeading___Toc5339_3488861905"/>
+      <w:bookmarkStart w:id="57" w:name="__RefHeading___Toc5339_1888984076"/>
       <w:bookmarkEnd w:id="57"/>
       <w:r>
         <w:rPr>
@@ -25849,7 +25849,7 @@
         <w:jc w:val="left"/>
         <w:rPr/>
       </w:pPr>
-      <w:bookmarkStart w:id="58" w:name="__RefHeading___Toc5341_3488861905"/>
+      <w:bookmarkStart w:id="58" w:name="__RefHeading___Toc5341_1888984076"/>
       <w:bookmarkEnd w:id="58"/>
       <w:r>
         <w:rPr>
@@ -25916,7 +25916,7 @@
         <w:jc w:val="left"/>
         <w:rPr/>
       </w:pPr>
-      <w:bookmarkStart w:id="59" w:name="__RefHeading___Toc5343_3488861905"/>
+      <w:bookmarkStart w:id="59" w:name="__RefHeading___Toc5343_1888984076"/>
       <w:bookmarkEnd w:id="59"/>
       <w:r>
         <w:rPr>
@@ -26748,7 +26748,7 @@
         <w:jc w:val="left"/>
         <w:rPr/>
       </w:pPr>
-      <w:bookmarkStart w:id="60" w:name="__RefHeading___Toc5345_3488861905"/>
+      <w:bookmarkStart w:id="60" w:name="__RefHeading___Toc5345_1888984076"/>
       <w:bookmarkEnd w:id="60"/>
       <w:r>
         <w:rPr>
@@ -27567,7 +27567,7 @@
         <w:jc w:val="center"/>
         <w:rPr/>
       </w:pPr>
-      <w:bookmarkStart w:id="61" w:name="__RefHeading___Toc5347_3488861905"/>
+      <w:bookmarkStart w:id="61" w:name="__RefHeading___Toc5347_1888984076"/>
       <w:bookmarkEnd w:id="61"/>
       <w:r>
         <w:rPr>
@@ -27872,7 +27872,7 @@
         <w:jc w:val="left"/>
         <w:rPr/>
       </w:pPr>
-      <w:bookmarkStart w:id="62" w:name="__RefHeading___Toc5349_3488861905"/>
+      <w:bookmarkStart w:id="62" w:name="__RefHeading___Toc5349_1888984076"/>
       <w:bookmarkEnd w:id="62"/>
       <w:r>
         <w:rPr>
@@ -27957,7 +27957,7 @@
         <w:jc w:val="left"/>
         <w:rPr/>
       </w:pPr>
-      <w:bookmarkStart w:id="63" w:name="__RefHeading___Toc5351_3488861905"/>
+      <w:bookmarkStart w:id="63" w:name="__RefHeading___Toc5351_1888984076"/>
       <w:bookmarkEnd w:id="63"/>
       <w:r>
         <w:rPr>
@@ -28283,7 +28283,7 @@
         <w:jc w:val="left"/>
         <w:rPr/>
       </w:pPr>
-      <w:bookmarkStart w:id="64" w:name="__RefHeading___Toc5353_3488861905"/>
+      <w:bookmarkStart w:id="64" w:name="__RefHeading___Toc5353_1888984076"/>
       <w:bookmarkEnd w:id="64"/>
       <w:r>
         <w:rPr>
@@ -28577,7 +28577,7 @@
         <w:jc w:val="left"/>
         <w:rPr/>
       </w:pPr>
-      <w:bookmarkStart w:id="65" w:name="__RefHeading___Toc5355_3488861905"/>
+      <w:bookmarkStart w:id="65" w:name="__RefHeading___Toc5355_1888984076"/>
       <w:bookmarkEnd w:id="65"/>
       <w:r>
         <w:rPr>
@@ -28633,7 +28633,7 @@
         <w:jc w:val="left"/>
         <w:rPr/>
       </w:pPr>
-      <w:bookmarkStart w:id="66" w:name="__RefHeading___Toc5357_3488861905"/>
+      <w:bookmarkStart w:id="66" w:name="__RefHeading___Toc5357_1888984076"/>
       <w:bookmarkEnd w:id="66"/>
       <w:r>
         <w:rPr>
@@ -28671,7 +28671,7 @@
         <w:jc w:val="left"/>
         <w:rPr/>
       </w:pPr>
-      <w:bookmarkStart w:id="67" w:name="__RefHeading___Toc5359_3488861905"/>
+      <w:bookmarkStart w:id="67" w:name="__RefHeading___Toc5359_1888984076"/>
       <w:bookmarkEnd w:id="67"/>
       <w:r>
         <w:rPr>
@@ -30311,7 +30311,7 @@
         <w:jc w:val="center"/>
         <w:rPr/>
       </w:pPr>
-      <w:bookmarkStart w:id="68" w:name="__RefHeading___Toc5361_3488861905"/>
+      <w:bookmarkStart w:id="68" w:name="__RefHeading___Toc5361_1888984076"/>
       <w:bookmarkEnd w:id="68"/>
       <w:r>
         <w:rPr>
@@ -30616,7 +30616,7 @@
         <w:jc w:val="left"/>
         <w:rPr/>
       </w:pPr>
-      <w:bookmarkStart w:id="69" w:name="__RefHeading___Toc5363_3488861905"/>
+      <w:bookmarkStart w:id="69" w:name="__RefHeading___Toc5363_1888984076"/>
       <w:bookmarkEnd w:id="69"/>
       <w:r>
         <w:rPr>
@@ -30834,7 +30834,7 @@
         <w:jc w:val="left"/>
         <w:rPr/>
       </w:pPr>
-      <w:bookmarkStart w:id="70" w:name="__RefHeading___Toc5365_3488861905"/>
+      <w:bookmarkStart w:id="70" w:name="__RefHeading___Toc5365_1888984076"/>
       <w:bookmarkEnd w:id="70"/>
       <w:r>
         <w:rPr>
@@ -30944,7 +30944,7 @@
         <w:jc w:val="left"/>
         <w:rPr/>
       </w:pPr>
-      <w:bookmarkStart w:id="71" w:name="__RefHeading___Toc5367_3488861905"/>
+      <w:bookmarkStart w:id="71" w:name="__RefHeading___Toc5367_1888984076"/>
       <w:bookmarkEnd w:id="71"/>
       <w:r>
         <w:rPr>
@@ -31231,7 +31231,7 @@
         <w:jc w:val="left"/>
         <w:rPr/>
       </w:pPr>
-      <w:bookmarkStart w:id="72" w:name="__RefHeading___Toc5369_3488861905"/>
+      <w:bookmarkStart w:id="72" w:name="__RefHeading___Toc5369_1888984076"/>
       <w:bookmarkEnd w:id="72"/>
       <w:r>
         <w:rPr>
@@ -31572,7 +31572,7 @@
         <w:jc w:val="left"/>
         <w:rPr/>
       </w:pPr>
-      <w:bookmarkStart w:id="73" w:name="__RefHeading___Toc5371_3488861905"/>
+      <w:bookmarkStart w:id="73" w:name="__RefHeading___Toc5371_1888984076"/>
       <w:bookmarkEnd w:id="73"/>
       <w:r>
         <w:rPr>
@@ -31760,7 +31760,7 @@
         <w:jc w:val="left"/>
         <w:rPr/>
       </w:pPr>
-      <w:bookmarkStart w:id="74" w:name="__RefHeading___Toc5373_3488861905"/>
+      <w:bookmarkStart w:id="74" w:name="__RefHeading___Toc5373_1888984076"/>
       <w:bookmarkEnd w:id="74"/>
       <w:r>
         <w:rPr>
@@ -32696,7 +32696,7 @@
         <w:jc w:val="left"/>
         <w:rPr/>
       </w:pPr>
-      <w:bookmarkStart w:id="75" w:name="__RefHeading___Toc5375_3488861905"/>
+      <w:bookmarkStart w:id="75" w:name="__RefHeading___Toc5375_1888984076"/>
       <w:bookmarkEnd w:id="75"/>
       <w:r>
         <w:rPr>
@@ -33551,7 +33551,7 @@
         <w:jc w:val="center"/>
         <w:rPr/>
       </w:pPr>
-      <w:bookmarkStart w:id="76" w:name="__RefHeading___Toc5377_3488861905"/>
+      <w:bookmarkStart w:id="76" w:name="__RefHeading___Toc5377_1888984076"/>
       <w:bookmarkEnd w:id="76"/>
       <w:r>
         <w:rPr>
@@ -33691,7 +33691,7 @@
         <w:jc w:val="center"/>
         <w:rPr/>
       </w:pPr>
-      <w:bookmarkStart w:id="77" w:name="__RefHeading___Toc5379_3488861905"/>
+      <w:bookmarkStart w:id="77" w:name="__RefHeading___Toc5379_1888984076"/>
       <w:bookmarkEnd w:id="77"/>
       <w:r>
         <w:rPr>
@@ -37382,7 +37382,7 @@
         <w:jc w:val="center"/>
         <w:rPr/>
       </w:pPr>
-      <w:bookmarkStart w:id="78" w:name="__RefHeading___Toc5381_3488861905"/>
+      <w:bookmarkStart w:id="78" w:name="__RefHeading___Toc5381_1888984076"/>
       <w:bookmarkEnd w:id="78"/>
       <w:r>
         <w:rPr>
@@ -37402,7 +37402,7 @@
         <w:jc w:val="left"/>
         <w:rPr/>
       </w:pPr>
-      <w:bookmarkStart w:id="79" w:name="__RefHeading___Toc5383_3488861905"/>
+      <w:bookmarkStart w:id="79" w:name="__RefHeading___Toc5383_1888984076"/>
       <w:bookmarkEnd w:id="79"/>
       <w:r>
         <w:rPr>
@@ -37843,7 +37843,7 @@
         <w:jc w:val="left"/>
         <w:rPr/>
       </w:pPr>
-      <w:bookmarkStart w:id="80" w:name="__RefHeading___Toc5385_3488861905"/>
+      <w:bookmarkStart w:id="80" w:name="__RefHeading___Toc5385_1888984076"/>
       <w:bookmarkEnd w:id="80"/>
       <w:r>
         <w:rPr>
@@ -38574,7 +38574,7 @@
         <w:jc w:val="left"/>
         <w:rPr/>
       </w:pPr>
-      <w:bookmarkStart w:id="81" w:name="__RefHeading___Toc5387_3488861905"/>
+      <w:bookmarkStart w:id="81" w:name="__RefHeading___Toc5387_1888984076"/>
       <w:bookmarkEnd w:id="81"/>
       <w:r>
         <w:rPr>
@@ -38719,7 +38719,7 @@
         <w:jc w:val="left"/>
         <w:rPr/>
       </w:pPr>
-      <w:bookmarkStart w:id="82" w:name="__RefHeading___Toc5389_3488861905"/>
+      <w:bookmarkStart w:id="82" w:name="__RefHeading___Toc5389_1888984076"/>
       <w:bookmarkEnd w:id="82"/>
       <w:r>
         <w:rPr>
@@ -39387,7 +39387,7 @@
         <w:jc w:val="left"/>
         <w:rPr/>
       </w:pPr>
-      <w:bookmarkStart w:id="83" w:name="__RefHeading___Toc5391_3488861905"/>
+      <w:bookmarkStart w:id="83" w:name="__RefHeading___Toc5391_1888984076"/>
       <w:bookmarkEnd w:id="83"/>
       <w:r>
         <w:rPr>
@@ -40171,7 +40171,7 @@
         <w:jc w:val="left"/>
         <w:rPr/>
       </w:pPr>
-      <w:bookmarkStart w:id="84" w:name="__RefHeading___Toc5393_3488861905"/>
+      <w:bookmarkStart w:id="84" w:name="__RefHeading___Toc5393_1888984076"/>
       <w:bookmarkEnd w:id="84"/>
       <w:r>
         <w:rPr>
@@ -41073,7 +41073,7 @@
         <w:jc w:val="left"/>
         <w:rPr/>
       </w:pPr>
-      <w:bookmarkStart w:id="85" w:name="__RefHeading___Toc5395_3488861905"/>
+      <w:bookmarkStart w:id="85" w:name="__RefHeading___Toc5395_1888984076"/>
       <w:bookmarkEnd w:id="85"/>
       <w:r>
         <w:rPr>
@@ -41939,7 +41939,7 @@
         <w:jc w:val="left"/>
         <w:rPr/>
       </w:pPr>
-      <w:bookmarkStart w:id="86" w:name="__RefHeading___Toc5397_3488861905"/>
+      <w:bookmarkStart w:id="86" w:name="__RefHeading___Toc5397_1888984076"/>
       <w:bookmarkEnd w:id="86"/>
       <w:r>
         <w:rPr>
@@ -42301,7 +42301,7 @@
         <w:jc w:val="left"/>
         <w:rPr/>
       </w:pPr>
-      <w:bookmarkStart w:id="87" w:name="__RefHeading___Toc5399_3488861905"/>
+      <w:bookmarkStart w:id="87" w:name="__RefHeading___Toc5399_1888984076"/>
       <w:bookmarkEnd w:id="87"/>
       <w:r>
         <w:rPr>
@@ -43045,7 +43045,7 @@
         <w:jc w:val="left"/>
         <w:rPr/>
       </w:pPr>
-      <w:bookmarkStart w:id="88" w:name="__RefHeading___Toc5401_3488861905"/>
+      <w:bookmarkStart w:id="88" w:name="__RefHeading___Toc5401_1888984076"/>
       <w:bookmarkEnd w:id="88"/>
       <w:r>
         <w:rPr>
@@ -44625,7 +44625,7 @@
         <w:jc w:val="center"/>
         <w:rPr/>
       </w:pPr>
-      <w:bookmarkStart w:id="89" w:name="__RefHeading___Toc5403_3488861905"/>
+      <w:bookmarkStart w:id="89" w:name="__RefHeading___Toc5403_1888984076"/>
       <w:bookmarkEnd w:id="89"/>
       <w:r>
         <w:rPr>
@@ -44645,7 +44645,7 @@
         <w:jc w:val="left"/>
         <w:rPr/>
       </w:pPr>
-      <w:bookmarkStart w:id="90" w:name="__RefHeading___Toc5405_3488861905"/>
+      <w:bookmarkStart w:id="90" w:name="__RefHeading___Toc5405_1888984076"/>
       <w:bookmarkEnd w:id="90"/>
       <w:r>
         <w:rPr>
@@ -44737,7 +44737,7 @@
         <w:jc w:val="left"/>
         <w:rPr/>
       </w:pPr>
-      <w:bookmarkStart w:id="91" w:name="__RefHeading___Toc5407_3488861905"/>
+      <w:bookmarkStart w:id="91" w:name="__RefHeading___Toc5407_1888984076"/>
       <w:bookmarkEnd w:id="91"/>
       <w:r>
         <w:rPr>
@@ -44847,7 +44847,7 @@
         <w:jc w:val="left"/>
         <w:rPr/>
       </w:pPr>
-      <w:bookmarkStart w:id="92" w:name="__RefHeading___Toc5409_3488861905"/>
+      <w:bookmarkStart w:id="92" w:name="__RefHeading___Toc5409_1888984076"/>
       <w:bookmarkEnd w:id="92"/>
       <w:r>
         <w:rPr>
@@ -44921,7 +44921,7 @@
         <w:jc w:val="left"/>
         <w:rPr/>
       </w:pPr>
-      <w:bookmarkStart w:id="93" w:name="__RefHeading___Toc5411_3488861905"/>
+      <w:bookmarkStart w:id="93" w:name="__RefHeading___Toc5411_1888984076"/>
       <w:bookmarkEnd w:id="93"/>
       <w:r>
         <w:rPr>
@@ -45283,7 +45283,7 @@
         <w:jc w:val="left"/>
         <w:rPr/>
       </w:pPr>
-      <w:bookmarkStart w:id="94" w:name="__RefHeading___Toc5413_3488861905"/>
+      <w:bookmarkStart w:id="94" w:name="__RefHeading___Toc5413_1888984076"/>
       <w:bookmarkEnd w:id="94"/>
       <w:r>
         <w:rPr>
@@ -45424,7 +45424,7 @@
     </w:r>
     <w:r>
       <w:rPr/>
-      <w:t>121</w:t>
+      <w:t>120</w:t>
     </w:r>
     <w:r>
       <w:rPr/>
@@ -45477,7 +45477,7 @@
   <w:footnote w:id="2">
     <w:p>
       <w:pPr>
-        <w:pStyle w:val="Normal"/>
+        <w:pStyle w:val="FootnoteText"/>
         <w:spacing w:lineRule="auto" w:line="240" w:before="0" w:after="0"/>
         <w:jc w:val="both"/>
         <w:rPr/>
@@ -45492,6 +45492,7 @@
         <w:rPr>
           <w:rFonts w:cs="Times New Roman"/>
           <w:sz w:val="20"/>
+          <w:szCs w:val="20"/>
         </w:rPr>
         <w:t xml:space="preserve"> </w:t>
       </w:r>
@@ -45499,6 +45500,7 @@
         <w:rPr>
           <w:rFonts w:cs="Times New Roman"/>
           <w:sz w:val="20"/>
+          <w:szCs w:val="20"/>
         </w:rPr>
         <w:t>Anderson L.W., Krathwohl D.R. (Eds.) A Taxonomy for Learning, Teaching, and Assessing: A Revision of Bloom’s Taxonomy of Educational Objectives. – New York: Longman, 2001.</w:t>
       </w:r>
@@ -45507,7 +45509,7 @@
   <w:footnote w:id="3">
     <w:p>
       <w:pPr>
-        <w:pStyle w:val="Normal"/>
+        <w:pStyle w:val="FootnoteText"/>
         <w:spacing w:lineRule="auto" w:line="240" w:before="0" w:after="0"/>
         <w:jc w:val="both"/>
         <w:rPr/>
@@ -45522,6 +45524,7 @@
         <w:rPr>
           <w:rFonts w:cs="Times New Roman"/>
           <w:sz w:val="20"/>
+          <w:szCs w:val="20"/>
         </w:rPr>
         <w:t xml:space="preserve"> </w:t>
       </w:r>
@@ -45529,6 +45532,7 @@
         <w:rPr>
           <w:rFonts w:cs="Times New Roman"/>
           <w:sz w:val="20"/>
+          <w:szCs w:val="20"/>
         </w:rPr>
         <w:t>O‘zbekiston Respublikasining “Ta’lim to‘g‘risida”gi Qonuni. 2020-yil 23-sentabr, O‘RQ-637-son // Qonunchilik ma’lumotlari milliy bazasi: www.lex.uz.</w:t>
       </w:r>
@@ -45537,7 +45541,7 @@
   <w:footnote w:id="4">
     <w:p>
       <w:pPr>
-        <w:pStyle w:val="Normal"/>
+        <w:pStyle w:val="FootnoteText"/>
         <w:spacing w:lineRule="auto" w:line="240" w:before="0" w:after="0"/>
         <w:jc w:val="both"/>
         <w:rPr/>
@@ -45552,6 +45556,7 @@
         <w:rPr>
           <w:rFonts w:cs="Times New Roman"/>
           <w:sz w:val="20"/>
+          <w:szCs w:val="20"/>
         </w:rPr>
         <w:t xml:space="preserve"> </w:t>
       </w:r>
@@ -45559,6 +45564,7 @@
         <w:rPr>
           <w:rFonts w:cs="Times New Roman"/>
           <w:sz w:val="20"/>
+          <w:szCs w:val="20"/>
         </w:rPr>
         <w:t>Mahmudova D.B. Metodika fanlarini o‘qitish texnologiyasi: darslik. – Chirchiq, 2024.</w:t>
       </w:r>
@@ -45567,7 +45573,7 @@
   <w:footnote w:id="5">
     <w:p>
       <w:pPr>
-        <w:pStyle w:val="Normal"/>
+        <w:pStyle w:val="FootnoteText"/>
         <w:spacing w:lineRule="auto" w:line="240" w:before="0" w:after="0"/>
         <w:jc w:val="both"/>
         <w:rPr/>
@@ -45582,6 +45588,7 @@
         <w:rPr>
           <w:rFonts w:cs="Times New Roman"/>
           <w:sz w:val="20"/>
+          <w:szCs w:val="20"/>
         </w:rPr>
         <w:t xml:space="preserve"> </w:t>
       </w:r>
@@ -45589,6 +45596,7 @@
         <w:rPr>
           <w:rFonts w:cs="Times New Roman"/>
           <w:sz w:val="20"/>
+          <w:szCs w:val="20"/>
         </w:rPr>
         <w:t>Tairova M.B. Metodika fanlarni o‘qitish texnologiyasi. – Toshkent: “Metodist nashriyoti”, 2023.</w:t>
       </w:r>
@@ -45597,7 +45605,7 @@
   <w:footnote w:id="6">
     <w:p>
       <w:pPr>
-        <w:pStyle w:val="Normal"/>
+        <w:pStyle w:val="FootnoteText"/>
         <w:spacing w:lineRule="auto" w:line="240" w:before="0" w:after="0"/>
         <w:jc w:val="both"/>
         <w:rPr/>
@@ -45612,6 +45620,7 @@
         <w:rPr>
           <w:rFonts w:cs="Times New Roman"/>
           <w:sz w:val="20"/>
+          <w:szCs w:val="20"/>
         </w:rPr>
         <w:t xml:space="preserve"> </w:t>
       </w:r>
@@ -45619,6 +45628,7 @@
         <w:rPr>
           <w:rFonts w:cs="Times New Roman"/>
           <w:sz w:val="20"/>
+          <w:szCs w:val="20"/>
         </w:rPr>
         <w:t>Беспалько В.П. Слагаемые педагогической технологии. – М.: Педагогика, 1989.</w:t>
       </w:r>
@@ -45627,7 +45637,7 @@
   <w:footnote w:id="7">
     <w:p>
       <w:pPr>
-        <w:pStyle w:val="Normal"/>
+        <w:pStyle w:val="FootnoteText"/>
         <w:spacing w:lineRule="auto" w:line="240" w:before="0" w:after="0"/>
         <w:jc w:val="both"/>
         <w:rPr/>
@@ -45642,6 +45652,7 @@
         <w:rPr>
           <w:rFonts w:cs="Times New Roman"/>
           <w:sz w:val="20"/>
+          <w:szCs w:val="20"/>
         </w:rPr>
         <w:t xml:space="preserve"> </w:t>
       </w:r>
@@ -45649,6 +45660,7 @@
         <w:rPr>
           <w:rFonts w:cs="Times New Roman"/>
           <w:sz w:val="20"/>
+          <w:szCs w:val="20"/>
         </w:rPr>
         <w:t>Qarang: Кларин М.В. Педагогическая технология в учебном процессе: анализ зарубежного опыта. – М.: Знание, 1989.</w:t>
       </w:r>
@@ -45657,7 +45669,7 @@
   <w:footnote w:id="8">
     <w:p>
       <w:pPr>
-        <w:pStyle w:val="Normal"/>
+        <w:pStyle w:val="FootnoteText"/>
         <w:spacing w:lineRule="auto" w:line="240" w:before="0" w:after="0"/>
         <w:jc w:val="both"/>
         <w:rPr/>
@@ -45672,6 +45684,7 @@
         <w:rPr>
           <w:rFonts w:cs="Times New Roman"/>
           <w:sz w:val="20"/>
+          <w:szCs w:val="20"/>
         </w:rPr>
         <w:t xml:space="preserve"> </w:t>
       </w:r>
@@ -45679,6 +45692,7 @@
         <w:rPr>
           <w:rFonts w:cs="Times New Roman"/>
           <w:sz w:val="20"/>
+          <w:szCs w:val="20"/>
         </w:rPr>
         <w:t>Селевко Г.К. Современные образовательные технологии: учебное пособие. – М.: Народное образование, 1998.</w:t>
       </w:r>
@@ -45687,7 +45701,7 @@
   <w:footnote w:id="9">
     <w:p>
       <w:pPr>
-        <w:pStyle w:val="Normal"/>
+        <w:pStyle w:val="FootnoteText"/>
         <w:spacing w:lineRule="auto" w:line="240" w:before="0" w:after="0"/>
         <w:jc w:val="both"/>
         <w:rPr/>
@@ -45702,6 +45716,7 @@
         <w:rPr>
           <w:rFonts w:cs="Times New Roman"/>
           <w:sz w:val="20"/>
+          <w:szCs w:val="20"/>
         </w:rPr>
         <w:t xml:space="preserve"> </w:t>
       </w:r>
@@ -45709,6 +45724,7 @@
         <w:rPr>
           <w:rFonts w:cs="Times New Roman"/>
           <w:sz w:val="20"/>
+          <w:szCs w:val="20"/>
         </w:rPr>
         <w:t>Montessori M. The Montessori Method. – New York: Frederick A. Stokes Company, 1912.</w:t>
       </w:r>
@@ -45717,7 +45733,7 @@
   <w:footnote w:id="10">
     <w:p>
       <w:pPr>
-        <w:pStyle w:val="Normal"/>
+        <w:pStyle w:val="FootnoteText"/>
         <w:spacing w:lineRule="auto" w:line="240" w:before="0" w:after="0"/>
         <w:jc w:val="both"/>
         <w:rPr/>
@@ -45732,6 +45748,7 @@
         <w:rPr>
           <w:rFonts w:cs="Times New Roman"/>
           <w:sz w:val="20"/>
+          <w:szCs w:val="20"/>
         </w:rPr>
         <w:t xml:space="preserve"> </w:t>
       </w:r>
@@ -45739,6 +45756,7 @@
         <w:rPr>
           <w:rFonts w:cs="Times New Roman"/>
           <w:sz w:val="20"/>
+          <w:szCs w:val="20"/>
         </w:rPr>
         <w:t>Bloom B.S. (Ed.) Taxonomy of Educational Objectives. Handbook I: Cognitive Domain. – New York: David McKay, 1956.</w:t>
       </w:r>
@@ -45747,7 +45765,7 @@
   <w:footnote w:id="11">
     <w:p>
       <w:pPr>
-        <w:pStyle w:val="Normal"/>
+        <w:pStyle w:val="FootnoteText"/>
         <w:spacing w:lineRule="auto" w:line="240" w:before="0" w:after="0"/>
         <w:jc w:val="both"/>
         <w:rPr/>
@@ -45762,6 +45780,7 @@
         <w:rPr>
           <w:rFonts w:cs="Times New Roman"/>
           <w:sz w:val="20"/>
+          <w:szCs w:val="20"/>
         </w:rPr>
         <w:t xml:space="preserve"> “</w:t>
       </w:r>
@@ -45769,6 +45788,7 @@
         <w:rPr>
           <w:rFonts w:cs="Times New Roman"/>
           <w:sz w:val="20"/>
+          <w:szCs w:val="20"/>
         </w:rPr>
         <w:t>Ilk qadam” maktabgacha ta’lim tashkilotining davlat o‘quv dasturi. – Toshkent, 2018.</w:t>
       </w:r>
@@ -45777,7 +45797,7 @@
   <w:footnote w:id="12">
     <w:p>
       <w:pPr>
-        <w:pStyle w:val="Normal"/>
+        <w:pStyle w:val="FootnoteText"/>
         <w:spacing w:lineRule="auto" w:line="240" w:before="0" w:after="0"/>
         <w:jc w:val="both"/>
         <w:rPr/>
@@ -45792,6 +45812,7 @@
         <w:rPr>
           <w:rFonts w:cs="Times New Roman"/>
           <w:sz w:val="20"/>
+          <w:szCs w:val="20"/>
         </w:rPr>
         <w:t xml:space="preserve"> </w:t>
       </w:r>
@@ -45799,6 +45820,7 @@
         <w:rPr>
           <w:rFonts w:cs="Times New Roman"/>
           <w:sz w:val="20"/>
+          <w:szCs w:val="20"/>
         </w:rPr>
         <w:t>Бабанский Ю.К. Педагогика: учебное пособие для студентов педагогических институтов. – 2-е изд. – М.: Просвещение, 1988.</w:t>
       </w:r>
@@ -45807,7 +45829,7 @@
   <w:footnote w:id="13">
     <w:p>
       <w:pPr>
-        <w:pStyle w:val="Normal"/>
+        <w:pStyle w:val="FootnoteText"/>
         <w:spacing w:lineRule="auto" w:line="240" w:before="0" w:after="0"/>
         <w:jc w:val="both"/>
         <w:rPr/>
@@ -45822,6 +45844,7 @@
         <w:rPr>
           <w:rFonts w:cs="Times New Roman"/>
           <w:sz w:val="20"/>
+          <w:szCs w:val="20"/>
         </w:rPr>
         <w:t xml:space="preserve"> </w:t>
       </w:r>
@@ -45829,6 +45852,7 @@
         <w:rPr>
           <w:rFonts w:cs="Times New Roman"/>
           <w:sz w:val="20"/>
+          <w:szCs w:val="20"/>
         </w:rPr>
         <w:t>Коменский Я.А. Великая дидактика // Избранные педагогические сочинения: в 2 т. Т. 1. – М.: Педагогика, 1982.</w:t>
       </w:r>
@@ -45837,7 +45861,7 @@
   <w:footnote w:id="14">
     <w:p>
       <w:pPr>
-        <w:pStyle w:val="Normal"/>
+        <w:pStyle w:val="FootnoteText"/>
         <w:spacing w:lineRule="auto" w:line="240" w:before="0" w:after="0"/>
         <w:jc w:val="both"/>
         <w:rPr/>
@@ -45852,6 +45876,7 @@
         <w:rPr>
           <w:rFonts w:cs="Times New Roman"/>
           <w:sz w:val="20"/>
+          <w:szCs w:val="20"/>
         </w:rPr>
         <w:t xml:space="preserve"> </w:t>
       </w:r>
@@ -45859,6 +45884,7 @@
         <w:rPr>
           <w:rFonts w:cs="Times New Roman"/>
           <w:sz w:val="20"/>
+          <w:szCs w:val="20"/>
         </w:rPr>
         <w:t>Ушинский К.Д. Человек как предмет воспитания. Опыт педагогической антропологии. – СПб., 1868.</w:t>
       </w:r>
@@ -45867,7 +45893,7 @@
   <w:footnote w:id="15">
     <w:p>
       <w:pPr>
-        <w:pStyle w:val="Normal"/>
+        <w:pStyle w:val="FootnoteText"/>
         <w:spacing w:lineRule="auto" w:line="240" w:before="0" w:after="0"/>
         <w:jc w:val="both"/>
         <w:rPr/>
@@ -45882,6 +45908,7 @@
         <w:rPr>
           <w:rFonts w:cs="Times New Roman"/>
           <w:sz w:val="20"/>
+          <w:szCs w:val="20"/>
         </w:rPr>
         <w:t xml:space="preserve"> </w:t>
       </w:r>
@@ -45889,6 +45916,7 @@
         <w:rPr>
           <w:rFonts w:cs="Times New Roman"/>
           <w:sz w:val="20"/>
+          <w:szCs w:val="20"/>
         </w:rPr>
         <w:t>Qarang: Djamilova N.N. Pedagogika fanlarni o‘qitish metodikasi. – Toshkent: “Innovatsiya ziyo”, 2021.</w:t>
       </w:r>
@@ -45897,7 +45925,7 @@
   <w:footnote w:id="16">
     <w:p>
       <w:pPr>
-        <w:pStyle w:val="Normal"/>
+        <w:pStyle w:val="FootnoteText"/>
         <w:spacing w:lineRule="auto" w:line="240" w:before="0" w:after="0"/>
         <w:jc w:val="both"/>
         <w:rPr/>
@@ -45912,6 +45940,7 @@
         <w:rPr>
           <w:rFonts w:cs="Times New Roman"/>
           <w:sz w:val="20"/>
+          <w:szCs w:val="20"/>
         </w:rPr>
         <w:t xml:space="preserve"> </w:t>
       </w:r>
@@ -45919,6 +45948,7 @@
         <w:rPr>
           <w:rFonts w:cs="Times New Roman"/>
           <w:sz w:val="20"/>
+          <w:szCs w:val="20"/>
         </w:rPr>
         <w:t>Turdiyeva I.S. Metodika fanlarini o‘qitish texnologiyasi. – Termiz: “Termiz publishing center”, 2023.</w:t>
       </w:r>
@@ -45927,7 +45957,7 @@
   <w:footnote w:id="17">
     <w:p>
       <w:pPr>
-        <w:pStyle w:val="Normal"/>
+        <w:pStyle w:val="FootnoteText"/>
         <w:spacing w:lineRule="auto" w:line="240" w:before="0" w:after="0"/>
         <w:jc w:val="both"/>
         <w:rPr/>
@@ -45942,6 +45972,7 @@
         <w:rPr>
           <w:rFonts w:cs="Times New Roman"/>
           <w:sz w:val="20"/>
+          <w:szCs w:val="20"/>
         </w:rPr>
         <w:t xml:space="preserve"> </w:t>
       </w:r>
@@ -45949,6 +45980,7 @@
         <w:rPr>
           <w:rFonts w:cs="Times New Roman"/>
           <w:sz w:val="20"/>
+          <w:szCs w:val="20"/>
         </w:rPr>
         <w:t>O‘zbekiston Respublikasining “Ta’lim to‘g‘risida”gi Qonuni. 2020-yil 23-sentabr, O‘RQ-637-son // Qonunchilik ma’lumotlari milliy bazasi: www.lex.uz.</w:t>
       </w:r>
@@ -45957,7 +45989,7 @@
   <w:footnote w:id="18">
     <w:p>
       <w:pPr>
-        <w:pStyle w:val="Normal"/>
+        <w:pStyle w:val="FootnoteText"/>
         <w:spacing w:lineRule="auto" w:line="240" w:before="0" w:after="0"/>
         <w:jc w:val="both"/>
         <w:rPr/>
@@ -45972,6 +46004,7 @@
         <w:rPr>
           <w:rFonts w:cs="Times New Roman"/>
           <w:sz w:val="20"/>
+          <w:szCs w:val="20"/>
         </w:rPr>
         <w:t xml:space="preserve"> </w:t>
       </w:r>
@@ -45979,6 +46012,7 @@
         <w:rPr>
           <w:rFonts w:cs="Times New Roman"/>
           <w:sz w:val="20"/>
+          <w:szCs w:val="20"/>
         </w:rPr>
         <w:t>Djamilova N.N., Mahmudova O.A., Imamova N.Z. Metodika fanlarni o‘qitish texnologiyasi. – Toshkent: “Metodist nashriyoti”, 2023.</w:t>
       </w:r>
@@ -45987,7 +46021,7 @@
   <w:footnote w:id="19">
     <w:p>
       <w:pPr>
-        <w:pStyle w:val="Normal"/>
+        <w:pStyle w:val="FootnoteText"/>
         <w:spacing w:lineRule="auto" w:line="240" w:before="0" w:after="0"/>
         <w:jc w:val="both"/>
         <w:rPr/>
@@ -46002,6 +46036,7 @@
         <w:rPr>
           <w:rFonts w:cs="Times New Roman"/>
           <w:sz w:val="20"/>
+          <w:szCs w:val="20"/>
         </w:rPr>
         <w:t xml:space="preserve"> </w:t>
       </w:r>
@@ -46009,6 +46044,7 @@
         <w:rPr>
           <w:rFonts w:cs="Times New Roman"/>
           <w:sz w:val="20"/>
+          <w:szCs w:val="20"/>
         </w:rPr>
         <w:t>O‘zbekiston Respublikasining “Maktabgacha ta’lim va tarbiya to‘g‘risida”gi Qonuni. 2019-yil 16-dekabr, O‘RQ-595-son // Qonunchilik ma’lumotlari milliy bazasi: www.lex.uz.</w:t>
       </w:r>
@@ -46017,7 +46053,7 @@
   <w:footnote w:id="20">
     <w:p>
       <w:pPr>
-        <w:pStyle w:val="Normal"/>
+        <w:pStyle w:val="FootnoteText"/>
         <w:spacing w:lineRule="auto" w:line="240" w:before="0" w:after="0"/>
         <w:jc w:val="both"/>
         <w:rPr/>
@@ -46032,6 +46068,7 @@
         <w:rPr>
           <w:rFonts w:cs="Times New Roman"/>
           <w:sz w:val="20"/>
+          <w:szCs w:val="20"/>
         </w:rPr>
         <w:t xml:space="preserve"> </w:t>
       </w:r>
@@ -46039,6 +46076,7 @@
         <w:rPr>
           <w:rFonts w:cs="Times New Roman"/>
           <w:sz w:val="20"/>
+          <w:szCs w:val="20"/>
         </w:rPr>
         <w:t>Maktabgacha ta’lim va tarbiyaning davlat standarti. O‘zbekiston Respublikasi Vazirlar Mahkamasining 2020-yil 22-dekabrdagi 802-son qarori bilan tasdiqlangan // www.lex.uz.</w:t>
       </w:r>
@@ -46047,7 +46085,7 @@
   <w:footnote w:id="21">
     <w:p>
       <w:pPr>
-        <w:pStyle w:val="Normal"/>
+        <w:pStyle w:val="FootnoteText"/>
         <w:spacing w:lineRule="auto" w:line="240" w:before="0" w:after="0"/>
         <w:jc w:val="both"/>
         <w:rPr/>
@@ -46062,6 +46100,7 @@
         <w:rPr>
           <w:rFonts w:cs="Times New Roman"/>
           <w:sz w:val="20"/>
+          <w:szCs w:val="20"/>
         </w:rPr>
         <w:t xml:space="preserve"> “</w:t>
       </w:r>
@@ -46069,6 +46108,7 @@
         <w:rPr>
           <w:rFonts w:cs="Times New Roman"/>
           <w:sz w:val="20"/>
+          <w:szCs w:val="20"/>
         </w:rPr>
         <w:t>Ilk qadam” maktabgacha ta’lim tashkilotining davlat o‘quv dasturi. – Toshkent, 2018.</w:t>
       </w:r>
@@ -46077,7 +46117,7 @@
   <w:footnote w:id="22">
     <w:p>
       <w:pPr>
-        <w:pStyle w:val="Normal"/>
+        <w:pStyle w:val="FootnoteText"/>
         <w:spacing w:lineRule="auto" w:line="240" w:before="0" w:after="0"/>
         <w:jc w:val="both"/>
         <w:rPr/>
@@ -46092,6 +46132,7 @@
         <w:rPr>
           <w:rFonts w:cs="Times New Roman"/>
           <w:sz w:val="20"/>
+          <w:szCs w:val="20"/>
         </w:rPr>
         <w:t xml:space="preserve"> </w:t>
       </w:r>
@@ -46099,6 +46140,7 @@
         <w:rPr>
           <w:rFonts w:cs="Times New Roman"/>
           <w:sz w:val="20"/>
+          <w:szCs w:val="20"/>
         </w:rPr>
         <w:t>Qodirova U. Metodika fanlarni o‘qitish texnologiyasi. – Andijon: “Omadbek number one print”, 2026.</w:t>
       </w:r>
@@ -46107,7 +46149,7 @@
   <w:footnote w:id="23">
     <w:p>
       <w:pPr>
-        <w:pStyle w:val="Normal"/>
+        <w:pStyle w:val="FootnoteText"/>
         <w:spacing w:lineRule="auto" w:line="240" w:before="0" w:after="0"/>
         <w:jc w:val="both"/>
         <w:rPr/>
@@ -46122,6 +46164,7 @@
         <w:rPr>
           <w:rFonts w:cs="Times New Roman"/>
           <w:sz w:val="20"/>
+          <w:szCs w:val="20"/>
         </w:rPr>
         <w:t xml:space="preserve"> </w:t>
       </w:r>
@@ -46129,6 +46172,7 @@
         <w:rPr>
           <w:rFonts w:cs="Times New Roman"/>
           <w:sz w:val="20"/>
+          <w:szCs w:val="20"/>
         </w:rPr>
         <w:t>Mahmudova D.B. Metodika fanlarini o‘qitish texnologiyasi: darslik. – Chirchiq, 2024.</w:t>
       </w:r>
@@ -46137,7 +46181,7 @@
   <w:footnote w:id="24">
     <w:p>
       <w:pPr>
-        <w:pStyle w:val="Normal"/>
+        <w:pStyle w:val="FootnoteText"/>
         <w:spacing w:lineRule="auto" w:line="240" w:before="0" w:after="0"/>
         <w:jc w:val="both"/>
         <w:rPr/>
@@ -46152,6 +46196,7 @@
         <w:rPr>
           <w:rFonts w:cs="Times New Roman"/>
           <w:sz w:val="20"/>
+          <w:szCs w:val="20"/>
         </w:rPr>
         <w:t xml:space="preserve"> </w:t>
       </w:r>
@@ -46159,6 +46204,7 @@
         <w:rPr>
           <w:rFonts w:cs="Times New Roman"/>
           <w:sz w:val="20"/>
+          <w:szCs w:val="20"/>
         </w:rPr>
         <w:t>Бабанский Ю.К. Методы обучения в современной общеобразовательной школе. – М.: Просвещение, 1985.</w:t>
       </w:r>
@@ -46167,7 +46213,7 @@
   <w:footnote w:id="25">
     <w:p>
       <w:pPr>
-        <w:pStyle w:val="Normal"/>
+        <w:pStyle w:val="FootnoteText"/>
         <w:spacing w:lineRule="auto" w:line="240" w:before="0" w:after="0"/>
         <w:jc w:val="both"/>
         <w:rPr/>
@@ -46182,6 +46228,7 @@
         <w:rPr>
           <w:rFonts w:cs="Times New Roman"/>
           <w:sz w:val="20"/>
+          <w:szCs w:val="20"/>
         </w:rPr>
         <w:t xml:space="preserve"> </w:t>
       </w:r>
@@ -46189,6 +46236,7 @@
         <w:rPr>
           <w:rFonts w:cs="Times New Roman"/>
           <w:sz w:val="20"/>
+          <w:szCs w:val="20"/>
         </w:rPr>
         <w:t>Лернер И.Я. Дидактические основы методов обучения. – М.: Педагогика, 1981; Дидактика средней школы / под ред. М.Н.Скаткина. – 2-е изд. – М.: Просвещение, 1982.</w:t>
       </w:r>
@@ -46197,7 +46245,7 @@
   <w:footnote w:id="26">
     <w:p>
       <w:pPr>
-        <w:pStyle w:val="Normal"/>
+        <w:pStyle w:val="FootnoteText"/>
         <w:spacing w:lineRule="auto" w:line="240" w:before="0" w:after="0"/>
         <w:jc w:val="both"/>
         <w:rPr/>
@@ -46212,6 +46260,7 @@
         <w:rPr>
           <w:rFonts w:cs="Times New Roman"/>
           <w:sz w:val="20"/>
+          <w:szCs w:val="20"/>
         </w:rPr>
         <w:t xml:space="preserve"> </w:t>
       </w:r>
@@ -46219,6 +46268,7 @@
         <w:rPr>
           <w:rFonts w:cs="Times New Roman"/>
           <w:sz w:val="20"/>
+          <w:szCs w:val="20"/>
         </w:rPr>
         <w:t>Artikova M.B., To‘raboyeva M.R. Pedagogik texnologiyalar. – Toshkent: “Innovatsiya ziyo”, 2023.</w:t>
       </w:r>
@@ -46227,7 +46277,7 @@
   <w:footnote w:id="27">
     <w:p>
       <w:pPr>
-        <w:pStyle w:val="Normal"/>
+        <w:pStyle w:val="FootnoteText"/>
         <w:spacing w:lineRule="auto" w:line="240" w:before="0" w:after="0"/>
         <w:jc w:val="both"/>
         <w:rPr/>
@@ -46242,6 +46292,7 @@
         <w:rPr>
           <w:rFonts w:cs="Times New Roman"/>
           <w:sz w:val="20"/>
+          <w:szCs w:val="20"/>
         </w:rPr>
         <w:t xml:space="preserve"> </w:t>
       </w:r>
@@ -46249,6 +46300,7 @@
         <w:rPr>
           <w:rFonts w:cs="Times New Roman"/>
           <w:sz w:val="20"/>
+          <w:szCs w:val="20"/>
         </w:rPr>
         <w:t>Селевко Г.К. Современные образовательные технологии: учебное пособие. – М.: Народное образование, 1998.</w:t>
       </w:r>
@@ -46257,7 +46309,7 @@
   <w:footnote w:id="28">
     <w:p>
       <w:pPr>
-        <w:pStyle w:val="Normal"/>
+        <w:pStyle w:val="FootnoteText"/>
         <w:spacing w:lineRule="auto" w:line="240" w:before="0" w:after="0"/>
         <w:jc w:val="both"/>
         <w:rPr/>
@@ -46272,6 +46324,7 @@
         <w:rPr>
           <w:rFonts w:cs="Times New Roman"/>
           <w:sz w:val="20"/>
+          <w:szCs w:val="20"/>
         </w:rPr>
         <w:t xml:space="preserve"> </w:t>
       </w:r>
@@ -46279,6 +46332,7 @@
         <w:rPr>
           <w:rFonts w:cs="Times New Roman"/>
           <w:sz w:val="20"/>
+          <w:szCs w:val="20"/>
         </w:rPr>
         <w:t>Johnson D.W., Johnson R.T. Learning Together and Alone: Cooperative, Competitive, and Individualistic Learning. – Englewood Cliffs, NJ: Prentice-Hall, 1975.</w:t>
       </w:r>
@@ -46287,7 +46341,7 @@
   <w:footnote w:id="29">
     <w:p>
       <w:pPr>
-        <w:pStyle w:val="Normal"/>
+        <w:pStyle w:val="FootnoteText"/>
         <w:spacing w:lineRule="auto" w:line="240" w:before="0" w:after="0"/>
         <w:jc w:val="both"/>
         <w:rPr/>
@@ -46302,6 +46356,7 @@
         <w:rPr>
           <w:rFonts w:cs="Times New Roman"/>
           <w:sz w:val="20"/>
+          <w:szCs w:val="20"/>
         </w:rPr>
         <w:t xml:space="preserve"> </w:t>
       </w:r>
@@ -46309,6 +46364,7 @@
         <w:rPr>
           <w:rFonts w:cs="Times New Roman"/>
           <w:sz w:val="20"/>
+          <w:szCs w:val="20"/>
         </w:rPr>
         <w:t>Bozoova M., Xodjayev B. Pedagogik texnologiyalar. – Toshkent: “Metodist nashriyoti”, 2023.</w:t>
       </w:r>
@@ -46317,7 +46373,7 @@
   <w:footnote w:id="30">
     <w:p>
       <w:pPr>
-        <w:pStyle w:val="Normal"/>
+        <w:pStyle w:val="FootnoteText"/>
         <w:spacing w:lineRule="auto" w:line="240" w:before="0" w:after="0"/>
         <w:jc w:val="both"/>
         <w:rPr/>
@@ -46332,6 +46388,7 @@
         <w:rPr>
           <w:rFonts w:cs="Times New Roman"/>
           <w:sz w:val="20"/>
+          <w:szCs w:val="20"/>
         </w:rPr>
         <w:t xml:space="preserve"> </w:t>
       </w:r>
@@ -46339,6 +46396,7 @@
         <w:rPr>
           <w:rFonts w:cs="Times New Roman"/>
           <w:sz w:val="20"/>
+          <w:szCs w:val="20"/>
         </w:rPr>
         <w:t>Aronson E., Blaney N., Stephan C., Sikes J., Snapp M. The Jigsaw Classroom. – Beverly Hills, CA: Sage, 1978.</w:t>
       </w:r>
@@ -46347,7 +46405,7 @@
   <w:footnote w:id="31">
     <w:p>
       <w:pPr>
-        <w:pStyle w:val="Normal"/>
+        <w:pStyle w:val="FootnoteText"/>
         <w:spacing w:lineRule="auto" w:line="240" w:before="0" w:after="0"/>
         <w:jc w:val="both"/>
         <w:rPr/>
@@ -46362,6 +46420,7 @@
         <w:rPr>
           <w:rFonts w:cs="Times New Roman"/>
           <w:sz w:val="20"/>
+          <w:szCs w:val="20"/>
         </w:rPr>
         <w:t xml:space="preserve"> </w:t>
       </w:r>
@@ -46369,6 +46428,7 @@
         <w:rPr>
           <w:rFonts w:cs="Times New Roman"/>
           <w:sz w:val="20"/>
+          <w:szCs w:val="20"/>
         </w:rPr>
         <w:t>Bergmann J., Sams A. Flip Your Classroom: Reach Every Student in Every Class Every Day. – Eugene, OR: ISTE, 2012.</w:t>
       </w:r>
@@ -46377,7 +46437,7 @@
   <w:footnote w:id="32">
     <w:p>
       <w:pPr>
-        <w:pStyle w:val="Normal"/>
+        <w:pStyle w:val="FootnoteText"/>
         <w:spacing w:lineRule="auto" w:line="240" w:before="0" w:after="0"/>
         <w:jc w:val="both"/>
         <w:rPr/>
@@ -46392,6 +46452,7 @@
         <w:rPr>
           <w:rFonts w:cs="Times New Roman"/>
           <w:sz w:val="20"/>
+          <w:szCs w:val="20"/>
         </w:rPr>
         <w:t xml:space="preserve"> </w:t>
       </w:r>
@@ -46399,6 +46460,7 @@
         <w:rPr>
           <w:rFonts w:cs="Times New Roman"/>
           <w:sz w:val="20"/>
+          <w:szCs w:val="20"/>
         </w:rPr>
         <w:t>Махмутов М.И. Проблемное обучение. Основные вопросы теории. – М.: Педагогика, 1975.</w:t>
       </w:r>
@@ -46407,7 +46469,7 @@
   <w:footnote w:id="33">
     <w:p>
       <w:pPr>
-        <w:pStyle w:val="Normal"/>
+        <w:pStyle w:val="FootnoteText"/>
         <w:spacing w:lineRule="auto" w:line="240" w:before="0" w:after="0"/>
         <w:jc w:val="both"/>
         <w:rPr/>
@@ -46422,6 +46484,7 @@
         <w:rPr>
           <w:rFonts w:cs="Times New Roman"/>
           <w:sz w:val="20"/>
+          <w:szCs w:val="20"/>
         </w:rPr>
         <w:t xml:space="preserve"> </w:t>
       </w:r>
@@ -46429,6 +46492,7 @@
         <w:rPr>
           <w:rFonts w:cs="Times New Roman"/>
           <w:sz w:val="20"/>
+          <w:szCs w:val="20"/>
         </w:rPr>
         <w:t>Kolb D.A. Experiential Learning: Experience as the Source of Learning and Development. – Englewood Cliffs, NJ: Prentice-Hall, 1984.</w:t>
       </w:r>
@@ -46437,7 +46501,7 @@
   <w:footnote w:id="34">
     <w:p>
       <w:pPr>
-        <w:pStyle w:val="Normal"/>
+        <w:pStyle w:val="FootnoteText"/>
         <w:spacing w:lineRule="auto" w:line="240" w:before="0" w:after="0"/>
         <w:jc w:val="both"/>
         <w:rPr/>
@@ -46452,6 +46516,7 @@
         <w:rPr>
           <w:rFonts w:cs="Times New Roman"/>
           <w:sz w:val="20"/>
+          <w:szCs w:val="20"/>
         </w:rPr>
         <w:t xml:space="preserve"> </w:t>
       </w:r>
@@ -46459,6 +46524,7 @@
         <w:rPr>
           <w:rFonts w:cs="Times New Roman"/>
           <w:sz w:val="20"/>
+          <w:szCs w:val="20"/>
         </w:rPr>
         <w:t>Allen D., Ryan K. Microteaching. – Reading, MA: Addison-Wesley, 1969.</w:t>
       </w:r>
@@ -46467,7 +46533,7 @@
   <w:footnote w:id="35">
     <w:p>
       <w:pPr>
-        <w:pStyle w:val="Normal"/>
+        <w:pStyle w:val="FootnoteText"/>
         <w:spacing w:lineRule="auto" w:line="240" w:before="0" w:after="0"/>
         <w:jc w:val="both"/>
         <w:rPr/>
@@ -46482,6 +46548,7 @@
         <w:rPr>
           <w:rFonts w:cs="Times New Roman"/>
           <w:sz w:val="20"/>
+          <w:szCs w:val="20"/>
         </w:rPr>
         <w:t xml:space="preserve"> </w:t>
       </w:r>
@@ -46489,6 +46556,7 @@
         <w:rPr>
           <w:rFonts w:cs="Times New Roman"/>
           <w:sz w:val="20"/>
+          <w:szCs w:val="20"/>
         </w:rPr>
         <w:t>Turdiyeva I.S. Metodika fanlarini o‘qitish texnologiyasi. – Termiz: “Termiz publishing center”, 2023.</w:t>
       </w:r>
@@ -46497,7 +46565,7 @@
   <w:footnote w:id="36">
     <w:p>
       <w:pPr>
-        <w:pStyle w:val="Normal"/>
+        <w:pStyle w:val="FootnoteText"/>
         <w:spacing w:lineRule="auto" w:line="240" w:before="0" w:after="0"/>
         <w:jc w:val="both"/>
         <w:rPr/>
@@ -46512,6 +46580,7 @@
         <w:rPr>
           <w:rFonts w:cs="Times New Roman"/>
           <w:sz w:val="20"/>
+          <w:szCs w:val="20"/>
         </w:rPr>
         <w:t xml:space="preserve"> “</w:t>
       </w:r>
@@ -46519,6 +46588,7 @@
         <w:rPr>
           <w:rFonts w:cs="Times New Roman"/>
           <w:sz w:val="20"/>
+          <w:szCs w:val="20"/>
         </w:rPr>
         <w:t>Metodika fanlarni o‘qitish texnologiyasi” fanining o‘quv dasturi (sirtqi ta’lim shakli). – Andijon: ADPI, 2026.</w:t>
       </w:r>
@@ -46527,7 +46597,7 @@
   <w:footnote w:id="37">
     <w:p>
       <w:pPr>
-        <w:pStyle w:val="Normal"/>
+        <w:pStyle w:val="FootnoteText"/>
         <w:spacing w:lineRule="auto" w:line="240" w:before="0" w:after="0"/>
         <w:jc w:val="both"/>
         <w:rPr/>
@@ -46542,6 +46612,7 @@
         <w:rPr>
           <w:rFonts w:cs="Times New Roman"/>
           <w:sz w:val="20"/>
+          <w:szCs w:val="20"/>
         </w:rPr>
         <w:t xml:space="preserve"> “</w:t>
       </w:r>
@@ -46549,6 +46620,7 @@
         <w:rPr>
           <w:rFonts w:cs="Times New Roman"/>
           <w:sz w:val="20"/>
+          <w:szCs w:val="20"/>
         </w:rPr>
         <w:t>Metodika fanlarni o‘qitish texnologiyasi” fanining o‘quv dasturi (sirtqi ta’lim shakli). – Andijon: ADPI, 2026.</w:t>
       </w:r>
@@ -46557,7 +46629,7 @@
   <w:footnote w:id="38">
     <w:p>
       <w:pPr>
-        <w:pStyle w:val="Normal"/>
+        <w:pStyle w:val="FootnoteText"/>
         <w:spacing w:lineRule="auto" w:line="240" w:before="0" w:after="0"/>
         <w:jc w:val="both"/>
         <w:rPr/>
@@ -46572,6 +46644,7 @@
         <w:rPr>
           <w:rFonts w:cs="Times New Roman"/>
           <w:sz w:val="20"/>
+          <w:szCs w:val="20"/>
         </w:rPr>
         <w:t xml:space="preserve"> </w:t>
       </w:r>
@@ -46579,6 +46652,7 @@
         <w:rPr>
           <w:rFonts w:cs="Times New Roman"/>
           <w:sz w:val="20"/>
+          <w:szCs w:val="20"/>
         </w:rPr>
         <w:t>Black P., Wiliam D. Inside the Black Box: Raising Standards Through Classroom Assessment. – London: King’s College London, 1998.</w:t>
       </w:r>
@@ -48143,10 +48217,12 @@
       <w:spacing w:val="5"/>
     </w:rPr>
   </w:style>
-  <w:style w:type="character" w:styleId="FootnoteCharacters">
+  <w:style w:type="character" w:styleId="FootnoteCharacters" w:customStyle="1">
     <w:name w:val="Footnote Characters"/>
     <w:qFormat/>
-    <w:rPr/>
+    <w:rPr>
+      <w:vertAlign w:val="superscript"/>
+    </w:rPr>
   </w:style>
   <w:style w:type="character" w:styleId="FootnoteReference">
     <w:name w:val="Footnote Reference"/>
@@ -48647,11 +48723,15 @@
     </w:pPr>
     <w:rPr/>
   </w:style>
-  <w:style w:type="paragraph" w:styleId="FootnoteText">
+  <w:style w:type="paragraph" w:styleId="FootnoteText" w:customStyle="1">
     <w:name w:val="Footnote Text"/>
     <w:basedOn w:val="Normal"/>
-    <w:pPr/>
-    <w:rPr/>
+    <w:pPr>
+      <w:spacing w:lineRule="auto" w:line="240" w:before="0" w:after="0"/>
+    </w:pPr>
+    <w:rPr>
+      <w:sz w:val="20"/>
+    </w:rPr>
   </w:style>
   <w:style w:type="paragraph" w:styleId="TOC1">
     <w:name w:val="TOC 1"/>

</xml_diff>